<commit_message>
Rework air law talk: GOST and styled decks, gap analysis, simple English speech
- Two decks with the same content: strict GOST style and a styled version; logo on every slide, no footer line, group П-24-4 for both authors
- New structure: aim and tasks, regulation map, history of repealed SanPiN, gaps, foreign experience, proposals
- Article: added concrete proposals as a tracked change, removed the resolved group comment
- English speech rewritten in simple B1 English for Nikita and Ilya

Co-Authored-By: Claude Opus 5.5 <noreply@anthropic.com>
Claude-Session: https://claude.ai/code/session_01CdksXxatJkGzkSNxfzYT6S
</commit_message>
<xml_diff>
--- a/Speech_EN_Nikita_Ilya.docx
+++ b/Speech_EN_Nikita_Ilya.docx
@@ -265,7 +265,7 @@
                 <w:sz w:val="22"/>
                 <w:szCs w:val="22"/>
               </w:rPr>
-              <w:t xml:space="preserve">Professor Natalia S. Boyko, Department of Flight Operations and Flight Safety, Ulyanovsk Civil Aviation Institute</w:t>
+              <w:t xml:space="preserve">Professor Natalia S. Boyko, Department of Flight Operations and Flight Safety</w:t>
             </w:r>
           </w:p>
         </w:tc>
@@ -301,7 +301,7 @@
                 <w:sz w:val="22"/>
                 <w:szCs w:val="22"/>
               </w:rPr>
-              <w:t xml:space="preserve">Slides</w:t>
+              <w:t xml:space="preserve">Language</w:t>
             </w:r>
           </w:p>
         </w:tc>
@@ -332,7 +332,7 @@
                 <w:sz w:val="22"/>
                 <w:szCs w:val="22"/>
               </w:rPr>
-              <w:t xml:space="preserve">The slides are in Russian; this English text follows them slide by slide</w:t>
+              <w:t xml:space="preserve">Simple English (level B1): short sentences, common words</w:t>
             </w:r>
           </w:p>
         </w:tc>
@@ -368,6 +368,73 @@
                 <w:sz w:val="22"/>
                 <w:szCs w:val="22"/>
               </w:rPr>
+              <w:t xml:space="preserve">Slides</w:t>
+            </w:r>
+          </w:p>
+        </w:tc>
+        <w:tc>
+          <w:tcPr>
+            <w:tcW w:type="dxa" w:w="7438"/>
+            <w:tcBorders>
+              <w:top w:val="single" w:color="000000" w:sz="4"/>
+              <w:left w:val="single" w:color="000000" w:sz="4"/>
+              <w:bottom w:val="single" w:color="000000" w:sz="4"/>
+              <w:right w:val="single" w:color="000000" w:sz="4"/>
+            </w:tcBorders>
+            <w:tcMar>
+              <w:top w:type="dxa" w:w="60"/>
+              <w:left w:type="dxa" w:w="140"/>
+              <w:bottom w:type="dxa" w:w="60"/>
+              <w:right w:type="dxa" w:w="140"/>
+            </w:tcMar>
+            <w:vAlign w:val="top"/>
+          </w:tcPr>
+          <w:p>
+            <w:pPr>
+              <w:spacing w:after="0" w:before="0" w:line="260"/>
+            </w:pPr>
+            <w:r>
+              <w:rPr>
+                <w:rFonts w:ascii="Times New Roman" w:cs="Times New Roman" w:eastAsia="Times New Roman" w:hAnsi="Times New Roman"/>
+                <w:sz w:val="22"/>
+                <w:szCs w:val="22"/>
+              </w:rPr>
+              <w:t xml:space="preserve">The slides are in Russian; this English text follows them slide by slide</w:t>
+            </w:r>
+          </w:p>
+        </w:tc>
+      </w:tr>
+      <w:tr>
+        <w:tc>
+          <w:tcPr>
+            <w:tcW w:type="dxa" w:w="2200"/>
+            <w:tcBorders>
+              <w:top w:val="single" w:color="000000" w:sz="4"/>
+              <w:left w:val="single" w:color="000000" w:sz="4"/>
+              <w:bottom w:val="single" w:color="000000" w:sz="4"/>
+              <w:right w:val="single" w:color="000000" w:sz="4"/>
+            </w:tcBorders>
+            <w:shd w:fill="F2F2F2" w:color="auto" w:val="clear"/>
+            <w:tcMar>
+              <w:top w:type="dxa" w:w="60"/>
+              <w:left w:type="dxa" w:w="140"/>
+              <w:bottom w:type="dxa" w:w="60"/>
+              <w:right w:type="dxa" w:w="140"/>
+            </w:tcMar>
+            <w:vAlign w:val="top"/>
+          </w:tcPr>
+          <w:p>
+            <w:pPr>
+              <w:spacing w:after="0" w:before="0" w:line="260"/>
+            </w:pPr>
+            <w:r>
+              <w:rPr>
+                <w:rFonts w:ascii="Times New Roman" w:cs="Times New Roman" w:eastAsia="Times New Roman" w:hAnsi="Times New Roman"/>
+                <w:b/>
+                <w:bCs/>
+                <w:sz w:val="22"/>
+                <w:szCs w:val="22"/>
+              </w:rPr>
               <w:t xml:space="preserve">Timing</w:t>
             </w:r>
           </w:p>
@@ -399,7 +466,7 @@
                 <w:sz w:val="22"/>
                 <w:szCs w:val="22"/>
               </w:rPr>
-              <w:t xml:space="preserve">About 9 minutes at a calm pace (≈ 115 words per minute). Rehearse aloud with a timer.</w:t>
+              <w:t xml:space="preserve">About 8 minutes at a calm pace (≈ 110 words per minute). Rehearse aloud with a timer.</w:t>
             </w:r>
           </w:p>
         </w:tc>
@@ -724,7 +791,7 @@
                 <w:sz w:val="22"/>
                 <w:szCs w:val="22"/>
               </w:rPr>
-              <w:t xml:space="preserve">0:35</w:t>
+              <w:t xml:space="preserve">0:25</w:t>
             </w:r>
           </w:p>
         </w:tc>
@@ -791,7 +858,7 @@
                 <w:sz w:val="22"/>
                 <w:szCs w:val="22"/>
               </w:rPr>
-              <w:t xml:space="preserve">Relevance and Aim of the Work</w:t>
+              <w:t xml:space="preserve">Why the Topic Is Important</w:t>
             </w:r>
             <w:r>
               <w:rPr>
@@ -802,7 +869,7 @@
                 <w:sz w:val="20"/>
                 <w:szCs w:val="20"/>
               </w:rPr>
-              <w:t xml:space="preserve">  (Актуальность и цель работы)</w:t>
+              <w:t xml:space="preserve">  (Актуальность темы)</w:t>
             </w:r>
           </w:p>
         </w:tc>
@@ -868,7 +935,7 @@
                 <w:sz w:val="22"/>
                 <w:szCs w:val="22"/>
               </w:rPr>
-              <w:t xml:space="preserve">0:55</w:t>
+              <w:t xml:space="preserve">0:45</w:t>
             </w:r>
           </w:p>
         </w:tc>
@@ -935,7 +1002,7 @@
                 <w:sz w:val="22"/>
                 <w:szCs w:val="22"/>
               </w:rPr>
-              <w:t xml:space="preserve">Measurements on Board: Results of the Previous Work</w:t>
+              <w:t xml:space="preserve">Aim and Tasks</w:t>
             </w:r>
             <w:r>
               <w:rPr>
@@ -946,7 +1013,7 @@
                 <w:sz w:val="20"/>
                 <w:szCs w:val="20"/>
               </w:rPr>
-              <w:t xml:space="preserve">  (Измерения на борту: результаты предыдущей работы)</w:t>
+              <w:t xml:space="preserve">  (Цель и задачи исследования)</w:t>
             </w:r>
           </w:p>
         </w:tc>
@@ -1012,7 +1079,7 @@
                 <w:sz w:val="22"/>
                 <w:szCs w:val="22"/>
               </w:rPr>
-              <w:t xml:space="preserve">0:45</w:t>
+              <w:t xml:space="preserve">0:30</w:t>
             </w:r>
           </w:p>
         </w:tc>
@@ -1079,7 +1146,7 @@
                 <w:sz w:val="22"/>
                 <w:szCs w:val="22"/>
               </w:rPr>
-              <w:t xml:space="preserve">Recording the Readings: Novokuznetsk – Irkutsk Flight</w:t>
+              <w:t xml:space="preserve">Measurements on Board</w:t>
             </w:r>
             <w:r>
               <w:rPr>
@@ -1090,7 +1157,7 @@
                 <w:sz w:val="20"/>
                 <w:szCs w:val="20"/>
               </w:rPr>
-              <w:t xml:space="preserve">  (Регистрация показаний: рейс Новокузнецк – Иркутск)</w:t>
+              <w:t xml:space="preserve">  (Измерения на борту)</w:t>
             </w:r>
           </w:p>
         </w:tc>
@@ -1223,7 +1290,7 @@
                 <w:sz w:val="22"/>
                 <w:szCs w:val="22"/>
               </w:rPr>
-              <w:t xml:space="preserve">Why the Annual Dose Must Be Calculated</w:t>
+              <w:t xml:space="preserve">Readings on the Flight</w:t>
             </w:r>
             <w:r>
               <w:rPr>
@@ -1234,7 +1301,7 @@
                 <w:sz w:val="20"/>
                 <w:szCs w:val="20"/>
               </w:rPr>
-              <w:t xml:space="preserve">  (Почему годовую дозу нужно рассчитывать)</w:t>
+              <w:t xml:space="preserve">  (Показания на рейсе Новокузнецк – Иркутск)</w:t>
             </w:r>
           </w:p>
         </w:tc>
@@ -1300,7 +1367,7 @@
                 <w:sz w:val="22"/>
                 <w:szCs w:val="22"/>
               </w:rPr>
-              <w:t xml:space="preserve">0:50</w:t>
+              <w:t xml:space="preserve">0:15</w:t>
             </w:r>
           </w:p>
         </w:tc>
@@ -1369,7 +1436,7 @@
                 <w:sz w:val="22"/>
                 <w:szCs w:val="22"/>
               </w:rPr>
-              <w:t xml:space="preserve">Legal Basis and the Crew Dose Limit</w:t>
+              <w:t xml:space="preserve">Current Legal Regulation</w:t>
             </w:r>
             <w:r>
               <w:rPr>
@@ -1380,7 +1447,7 @@
                 <w:sz w:val="20"/>
                 <w:szCs w:val="20"/>
               </w:rPr>
-              <w:t xml:space="preserve">  (Правовая основа и предел дозы облучения экипажа)</w:t>
+              <w:t xml:space="preserve">  (Действующее правовое регулирование)</w:t>
             </w:r>
           </w:p>
         </w:tc>
@@ -1448,7 +1515,7 @@
                 <w:sz w:val="22"/>
                 <w:szCs w:val="22"/>
               </w:rPr>
-              <w:t xml:space="preserve">0:50</w:t>
+              <w:t xml:space="preserve">0:40</w:t>
             </w:r>
           </w:p>
         </w:tc>
@@ -1517,7 +1584,7 @@
                 <w:sz w:val="22"/>
                 <w:szCs w:val="22"/>
               </w:rPr>
-              <w:t xml:space="preserve">Changes in Sanitary Rules in 2021–2025</w:t>
+              <w:t xml:space="preserve">How the Rules Changed</w:t>
             </w:r>
             <w:r>
               <w:rPr>
@@ -1528,7 +1595,7 @@
                 <w:sz w:val="20"/>
                 <w:szCs w:val="20"/>
               </w:rPr>
-              <w:t xml:space="preserve">  (Изменения санитарных норм в 2021–2025 годах)</w:t>
+              <w:t xml:space="preserve">  (Изменения специального регулирования)</w:t>
             </w:r>
           </w:p>
         </w:tc>
@@ -1596,7 +1663,7 @@
                 <w:sz w:val="22"/>
                 <w:szCs w:val="22"/>
               </w:rPr>
-              <w:t xml:space="preserve">0:40</w:t>
+              <w:t xml:space="preserve">0:35</w:t>
             </w:r>
           </w:p>
         </w:tc>
@@ -1665,7 +1732,7 @@
                 <w:sz w:val="22"/>
                 <w:szCs w:val="22"/>
               </w:rPr>
-              <w:t xml:space="preserve">Employer’s Duties and the Special Assessment of Working Conditions</w:t>
+              <w:t xml:space="preserve">Gaps in the Law (1)</w:t>
             </w:r>
             <w:r>
               <w:rPr>
@@ -1676,7 +1743,7 @@
                 <w:sz w:val="20"/>
                 <w:szCs w:val="20"/>
               </w:rPr>
-              <w:t xml:space="preserve">  (Обязанности работодателя и специальная оценка условий труда)</w:t>
+              <w:t xml:space="preserve">  (Выявленные пробелы (1))</w:t>
             </w:r>
           </w:p>
         </w:tc>
@@ -1813,7 +1880,7 @@
                 <w:sz w:val="22"/>
                 <w:szCs w:val="22"/>
               </w:rPr>
-              <w:t xml:space="preserve">System of Legal Regulation</w:t>
+              <w:t xml:space="preserve">Gaps in the Law (2)</w:t>
             </w:r>
             <w:r>
               <w:rPr>
@@ -1824,7 +1891,7 @@
                 <w:sz w:val="20"/>
                 <w:szCs w:val="20"/>
               </w:rPr>
-              <w:t xml:space="preserve">  (Система правового регулирования)</w:t>
+              <w:t xml:space="preserve">  (Выявленные пробелы (2))</w:t>
             </w:r>
           </w:p>
         </w:tc>
@@ -1959,7 +2026,7 @@
                 <w:sz w:val="22"/>
                 <w:szCs w:val="22"/>
               </w:rPr>
-              <w:t xml:space="preserve">Flight Time Limits and Annual Dose Estimate</w:t>
+              <w:t xml:space="preserve">Foreign Experience</w:t>
             </w:r>
             <w:r>
               <w:rPr>
@@ -1970,7 +2037,7 @@
                 <w:sz w:val="20"/>
                 <w:szCs w:val="20"/>
               </w:rPr>
-              <w:t xml:space="preserve">  (Ограничение налёта и оценка годовой дозы)</w:t>
+              <w:t xml:space="preserve">  (Зарубежный опыт)</w:t>
             </w:r>
           </w:p>
         </w:tc>
@@ -2036,7 +2103,7 @@
                 <w:sz w:val="22"/>
                 <w:szCs w:val="22"/>
               </w:rPr>
-              <w:t xml:space="preserve">0:50</w:t>
+              <w:t xml:space="preserve">0:40</w:t>
             </w:r>
           </w:p>
         </w:tc>
@@ -2103,7 +2170,7 @@
                 <w:sz w:val="22"/>
                 <w:szCs w:val="22"/>
               </w:rPr>
-              <w:t xml:space="preserve">International Experience</w:t>
+              <w:t xml:space="preserve">Our Proposals (1)</w:t>
             </w:r>
             <w:r>
               <w:rPr>
@@ -2114,7 +2181,7 @@
                 <w:sz w:val="20"/>
                 <w:szCs w:val="20"/>
               </w:rPr>
-              <w:t xml:space="preserve">  (Международный опыт)</w:t>
+              <w:t xml:space="preserve">  (Предложения по совершенствованию (1))</w:t>
             </w:r>
           </w:p>
         </w:tc>
@@ -2249,7 +2316,7 @@
                 <w:sz w:val="22"/>
                 <w:szCs w:val="22"/>
               </w:rPr>
-              <w:t xml:space="preserve">Conclusions</w:t>
+              <w:t xml:space="preserve">Our Proposals (2)</w:t>
             </w:r>
             <w:r>
               <w:rPr>
@@ -2260,7 +2327,7 @@
                 <w:sz w:val="20"/>
                 <w:szCs w:val="20"/>
               </w:rPr>
-              <w:t xml:space="preserve">  (Выводы)</w:t>
+              <w:t xml:space="preserve">  (Предложения по совершенствованию (2))</w:t>
             </w:r>
           </w:p>
         </w:tc>
@@ -2397,7 +2464,7 @@
                 <w:sz w:val="22"/>
                 <w:szCs w:val="22"/>
               </w:rPr>
-              <w:t xml:space="preserve">References</w:t>
+              <w:t xml:space="preserve">Conclusions</w:t>
             </w:r>
             <w:r>
               <w:rPr>
@@ -2408,7 +2475,7 @@
                 <w:sz w:val="20"/>
                 <w:szCs w:val="20"/>
               </w:rPr>
-              <w:t xml:space="preserve">  (Список использованных источников)</w:t>
+              <w:t xml:space="preserve">  (Выводы)</w:t>
             </w:r>
           </w:p>
         </w:tc>
@@ -2476,7 +2543,7 @@
                 <w:sz w:val="22"/>
                 <w:szCs w:val="22"/>
               </w:rPr>
-              <w:t xml:space="preserve">0:10</w:t>
+              <w:t xml:space="preserve">0:30</w:t>
             </w:r>
           </w:p>
         </w:tc>
@@ -2545,7 +2612,7 @@
                 <w:sz w:val="22"/>
                 <w:szCs w:val="22"/>
               </w:rPr>
-              <w:t xml:space="preserve">Thank You</w:t>
+              <w:t xml:space="preserve">References</w:t>
             </w:r>
             <w:r>
               <w:rPr>
@@ -2556,7 +2623,7 @@
                 <w:sz w:val="20"/>
                 <w:szCs w:val="20"/>
               </w:rPr>
-              <w:t xml:space="preserve">  (Спасибо за внимание!)</w:t>
+              <w:t xml:space="preserve">  (Список использованных источников)</w:t>
             </w:r>
           </w:p>
         </w:tc>
@@ -2624,7 +2691,303 @@
                 <w:sz w:val="22"/>
                 <w:szCs w:val="22"/>
               </w:rPr>
-              <w:t xml:space="preserve">0:10</w:t>
+              <w:t xml:space="preserve">0:05</w:t>
+            </w:r>
+          </w:p>
+        </w:tc>
+      </w:tr>
+      <w:tr>
+        <w:tc>
+          <w:tcPr>
+            <w:tcW w:type="dxa" w:w="900"/>
+            <w:tcBorders>
+              <w:top w:val="single" w:color="000000" w:sz="4"/>
+              <w:left w:val="single" w:color="000000" w:sz="4"/>
+              <w:bottom w:val="single" w:color="000000" w:sz="4"/>
+              <w:right w:val="single" w:color="000000" w:sz="4"/>
+            </w:tcBorders>
+            <w:shd w:fill="E7E6E6" w:color="auto" w:val="clear"/>
+            <w:tcMar>
+              <w:top w:type="dxa" w:w="50"/>
+              <w:left w:type="dxa" w:w="140"/>
+              <w:bottom w:type="dxa" w:w="50"/>
+              <w:right w:type="dxa" w:w="140"/>
+            </w:tcMar>
+            <w:vAlign w:val="top"/>
+          </w:tcPr>
+          <w:p>
+            <w:pPr>
+              <w:spacing w:after="0" w:before="0" w:line="260"/>
+              <w:jc w:val="center"/>
+            </w:pPr>
+            <w:r>
+              <w:rPr>
+                <w:rFonts w:ascii="Times New Roman" w:cs="Times New Roman" w:eastAsia="Times New Roman" w:hAnsi="Times New Roman"/>
+                <w:b/>
+                <w:bCs/>
+                <w:sz w:val="22"/>
+                <w:szCs w:val="22"/>
+              </w:rPr>
+              <w:t xml:space="preserve">15</w:t>
+            </w:r>
+          </w:p>
+        </w:tc>
+        <w:tc>
+          <w:tcPr>
+            <w:tcW w:type="dxa" w:w="6338"/>
+            <w:tcBorders>
+              <w:top w:val="single" w:color="000000" w:sz="4"/>
+              <w:left w:val="single" w:color="000000" w:sz="4"/>
+              <w:bottom w:val="single" w:color="000000" w:sz="4"/>
+              <w:right w:val="single" w:color="000000" w:sz="4"/>
+            </w:tcBorders>
+            <w:shd w:fill="E7E6E6" w:color="auto" w:val="clear"/>
+            <w:tcMar>
+              <w:top w:type="dxa" w:w="50"/>
+              <w:left w:type="dxa" w:w="140"/>
+              <w:bottom w:type="dxa" w:w="50"/>
+              <w:right w:type="dxa" w:w="140"/>
+            </w:tcMar>
+            <w:vAlign w:val="top"/>
+          </w:tcPr>
+          <w:p>
+            <w:pPr>
+              <w:spacing w:after="0" w:before="0" w:line="260"/>
+            </w:pPr>
+            <w:r>
+              <w:rPr>
+                <w:rFonts w:ascii="Times New Roman" w:cs="Times New Roman" w:eastAsia="Times New Roman" w:hAnsi="Times New Roman"/>
+                <w:sz w:val="22"/>
+                <w:szCs w:val="22"/>
+              </w:rPr>
+              <w:t xml:space="preserve">References (continued)</w:t>
+            </w:r>
+            <w:r>
+              <w:rPr>
+                <w:rFonts w:ascii="Times New Roman" w:cs="Times New Roman" w:eastAsia="Times New Roman" w:hAnsi="Times New Roman"/>
+                <w:i/>
+                <w:iCs/>
+                <w:color w:val="404040"/>
+                <w:sz w:val="20"/>
+                <w:szCs w:val="20"/>
+              </w:rPr>
+              <w:t xml:space="preserve">  (Список использованных источников)</w:t>
+            </w:r>
+          </w:p>
+        </w:tc>
+        <w:tc>
+          <w:tcPr>
+            <w:tcW w:type="dxa" w:w="1400"/>
+            <w:tcBorders>
+              <w:top w:val="single" w:color="000000" w:sz="4"/>
+              <w:left w:val="single" w:color="000000" w:sz="4"/>
+              <w:bottom w:val="single" w:color="000000" w:sz="4"/>
+              <w:right w:val="single" w:color="000000" w:sz="4"/>
+            </w:tcBorders>
+            <w:shd w:fill="E7E6E6" w:color="auto" w:val="clear"/>
+            <w:tcMar>
+              <w:top w:type="dxa" w:w="50"/>
+              <w:left w:type="dxa" w:w="140"/>
+              <w:bottom w:type="dxa" w:w="50"/>
+              <w:right w:type="dxa" w:w="140"/>
+            </w:tcMar>
+            <w:vAlign w:val="top"/>
+          </w:tcPr>
+          <w:p>
+            <w:pPr>
+              <w:spacing w:after="0" w:before="0" w:line="260"/>
+              <w:jc w:val="center"/>
+            </w:pPr>
+            <w:r>
+              <w:rPr>
+                <w:rFonts w:ascii="Times New Roman" w:cs="Times New Roman" w:eastAsia="Times New Roman" w:hAnsi="Times New Roman"/>
+                <w:b/>
+                <w:bCs/>
+                <w:sz w:val="22"/>
+                <w:szCs w:val="22"/>
+              </w:rPr>
+              <w:t xml:space="preserve">ILYA</w:t>
+            </w:r>
+          </w:p>
+        </w:tc>
+        <w:tc>
+          <w:tcPr>
+            <w:tcW w:type="dxa" w:w="1000"/>
+            <w:tcBorders>
+              <w:top w:val="single" w:color="000000" w:sz="4"/>
+              <w:left w:val="single" w:color="000000" w:sz="4"/>
+              <w:bottom w:val="single" w:color="000000" w:sz="4"/>
+              <w:right w:val="single" w:color="000000" w:sz="4"/>
+            </w:tcBorders>
+            <w:shd w:fill="E7E6E6" w:color="auto" w:val="clear"/>
+            <w:tcMar>
+              <w:top w:type="dxa" w:w="50"/>
+              <w:left w:type="dxa" w:w="140"/>
+              <w:bottom w:type="dxa" w:w="50"/>
+              <w:right w:type="dxa" w:w="140"/>
+            </w:tcMar>
+            <w:vAlign w:val="top"/>
+          </w:tcPr>
+          <w:p>
+            <w:pPr>
+              <w:spacing w:after="0" w:before="0" w:line="260"/>
+              <w:jc w:val="center"/>
+            </w:pPr>
+            <w:r>
+              <w:rPr>
+                <w:rFonts w:ascii="Times New Roman" w:cs="Times New Roman" w:eastAsia="Times New Roman" w:hAnsi="Times New Roman"/>
+                <w:sz w:val="22"/>
+                <w:szCs w:val="22"/>
+              </w:rPr>
+              <w:t xml:space="preserve">0:05</w:t>
+            </w:r>
+          </w:p>
+        </w:tc>
+      </w:tr>
+      <w:tr>
+        <w:tc>
+          <w:tcPr>
+            <w:tcW w:type="dxa" w:w="900"/>
+            <w:tcBorders>
+              <w:top w:val="single" w:color="000000" w:sz="4"/>
+              <w:left w:val="single" w:color="000000" w:sz="4"/>
+              <w:bottom w:val="single" w:color="000000" w:sz="4"/>
+              <w:right w:val="single" w:color="000000" w:sz="4"/>
+            </w:tcBorders>
+            <w:shd w:fill="E7E6E6" w:color="auto" w:val="clear"/>
+            <w:tcMar>
+              <w:top w:type="dxa" w:w="50"/>
+              <w:left w:type="dxa" w:w="140"/>
+              <w:bottom w:type="dxa" w:w="50"/>
+              <w:right w:type="dxa" w:w="140"/>
+            </w:tcMar>
+            <w:vAlign w:val="top"/>
+          </w:tcPr>
+          <w:p>
+            <w:pPr>
+              <w:spacing w:after="0" w:before="0" w:line="260"/>
+              <w:jc w:val="center"/>
+            </w:pPr>
+            <w:r>
+              <w:rPr>
+                <w:rFonts w:ascii="Times New Roman" w:cs="Times New Roman" w:eastAsia="Times New Roman" w:hAnsi="Times New Roman"/>
+                <w:b/>
+                <w:bCs/>
+                <w:sz w:val="22"/>
+                <w:szCs w:val="22"/>
+              </w:rPr>
+              <w:t xml:space="preserve">16</w:t>
+            </w:r>
+          </w:p>
+        </w:tc>
+        <w:tc>
+          <w:tcPr>
+            <w:tcW w:type="dxa" w:w="6338"/>
+            <w:tcBorders>
+              <w:top w:val="single" w:color="000000" w:sz="4"/>
+              <w:left w:val="single" w:color="000000" w:sz="4"/>
+              <w:bottom w:val="single" w:color="000000" w:sz="4"/>
+              <w:right w:val="single" w:color="000000" w:sz="4"/>
+            </w:tcBorders>
+            <w:shd w:fill="E7E6E6" w:color="auto" w:val="clear"/>
+            <w:tcMar>
+              <w:top w:type="dxa" w:w="50"/>
+              <w:left w:type="dxa" w:w="140"/>
+              <w:bottom w:type="dxa" w:w="50"/>
+              <w:right w:type="dxa" w:w="140"/>
+            </w:tcMar>
+            <w:vAlign w:val="top"/>
+          </w:tcPr>
+          <w:p>
+            <w:pPr>
+              <w:spacing w:after="0" w:before="0" w:line="260"/>
+            </w:pPr>
+            <w:r>
+              <w:rPr>
+                <w:rFonts w:ascii="Times New Roman" w:cs="Times New Roman" w:eastAsia="Times New Roman" w:hAnsi="Times New Roman"/>
+                <w:sz w:val="22"/>
+                <w:szCs w:val="22"/>
+              </w:rPr>
+              <w:t xml:space="preserve">Thank You</w:t>
+            </w:r>
+            <w:r>
+              <w:rPr>
+                <w:rFonts w:ascii="Times New Roman" w:cs="Times New Roman" w:eastAsia="Times New Roman" w:hAnsi="Times New Roman"/>
+                <w:i/>
+                <w:iCs/>
+                <w:color w:val="404040"/>
+                <w:sz w:val="20"/>
+                <w:szCs w:val="20"/>
+              </w:rPr>
+              <w:t xml:space="preserve">  (Спасибо за внимание!)</w:t>
+            </w:r>
+          </w:p>
+        </w:tc>
+        <w:tc>
+          <w:tcPr>
+            <w:tcW w:type="dxa" w:w="1400"/>
+            <w:tcBorders>
+              <w:top w:val="single" w:color="000000" w:sz="4"/>
+              <w:left w:val="single" w:color="000000" w:sz="4"/>
+              <w:bottom w:val="single" w:color="000000" w:sz="4"/>
+              <w:right w:val="single" w:color="000000" w:sz="4"/>
+            </w:tcBorders>
+            <w:shd w:fill="E7E6E6" w:color="auto" w:val="clear"/>
+            <w:tcMar>
+              <w:top w:type="dxa" w:w="50"/>
+              <w:left w:type="dxa" w:w="140"/>
+              <w:bottom w:type="dxa" w:w="50"/>
+              <w:right w:type="dxa" w:w="140"/>
+            </w:tcMar>
+            <w:vAlign w:val="top"/>
+          </w:tcPr>
+          <w:p>
+            <w:pPr>
+              <w:spacing w:after="0" w:before="0" w:line="260"/>
+              <w:jc w:val="center"/>
+            </w:pPr>
+            <w:r>
+              <w:rPr>
+                <w:rFonts w:ascii="Times New Roman" w:cs="Times New Roman" w:eastAsia="Times New Roman" w:hAnsi="Times New Roman"/>
+                <w:b/>
+                <w:bCs/>
+                <w:sz w:val="22"/>
+                <w:szCs w:val="22"/>
+              </w:rPr>
+              <w:t xml:space="preserve">ILYA</w:t>
+            </w:r>
+          </w:p>
+        </w:tc>
+        <w:tc>
+          <w:tcPr>
+            <w:tcW w:type="dxa" w:w="1000"/>
+            <w:tcBorders>
+              <w:top w:val="single" w:color="000000" w:sz="4"/>
+              <w:left w:val="single" w:color="000000" w:sz="4"/>
+              <w:bottom w:val="single" w:color="000000" w:sz="4"/>
+              <w:right w:val="single" w:color="000000" w:sz="4"/>
+            </w:tcBorders>
+            <w:shd w:fill="E7E6E6" w:color="auto" w:val="clear"/>
+            <w:tcMar>
+              <w:top w:type="dxa" w:w="50"/>
+              <w:left w:type="dxa" w:w="140"/>
+              <w:bottom w:type="dxa" w:w="50"/>
+              <w:right w:type="dxa" w:w="140"/>
+            </w:tcMar>
+            <w:vAlign w:val="top"/>
+          </w:tcPr>
+          <w:p>
+            <w:pPr>
+              <w:spacing w:after="0" w:before="0" w:line="260"/>
+              <w:jc w:val="center"/>
+            </w:pPr>
+            <w:r>
+              <w:rPr>
+                <w:rFonts w:ascii="Times New Roman" w:cs="Times New Roman" w:eastAsia="Times New Roman" w:hAnsi="Times New Roman"/>
+                <w:sz w:val="22"/>
+                <w:szCs w:val="22"/>
+              </w:rPr>
+              <w:t xml:space="preserve">0:05</w:t>
             </w:r>
           </w:p>
         </w:tc>
@@ -2747,7 +3110,7 @@
                 <w:sz w:val="20"/>
                 <w:szCs w:val="20"/>
               </w:rPr>
-              <w:t xml:space="preserve">0:35</w:t>
+              <w:t xml:space="preserve">0:25</w:t>
             </w:r>
           </w:p>
         </w:tc>
@@ -2805,7 +3168,7 @@
                 <w:sz w:val="28"/>
                 <w:szCs w:val="28"/>
               </w:rPr>
-              <w:t xml:space="preserve">Good afternoon, members of the jury and dear colleagues. My name is Nikita Shutov, and this is my colleague Ilya Roldugin. We are cadets of the Ulyanovsk Civil Aviation Institute. We would like to present our paper “Cosmic Radiation Exposure of Aircraft Crew Members and Their Legal Protection in the Russian Federation”. Our academic supervisor is Professor Natalia Semenovna Boyko of the Department of Flight Operations and Flight Safety.</w:t>
+              <w:t xml:space="preserve">Good afternoon. My name is Nikita Shutov, and this is my colleague Ilya Roldugin. We are cadets of the Ulyanovsk Civil Aviation Institute. Our topic is “Cosmic radiation exposure of aircraft crew members and their legal protection in Russia”. Our supervisor is Professor Natalia Boyko.</w:t>
             </w:r>
           </w:p>
           <w:p>
@@ -2923,7 +3286,7 @@
                 <w:sz w:val="20"/>
                 <w:szCs w:val="20"/>
               </w:rPr>
-              <w:t xml:space="preserve">0:55</w:t>
+              <w:t xml:space="preserve">0:45</w:t>
             </w:r>
           </w:p>
         </w:tc>
@@ -2957,7 +3320,7 @@
                 <w:sz w:val="24"/>
                 <w:szCs w:val="24"/>
               </w:rPr>
-              <w:t xml:space="preserve">Relevance and Aim of the Work</w:t>
+              <w:t xml:space="preserve">Why the Topic Is Important</w:t>
             </w:r>
             <w:r>
               <w:rPr>
@@ -2968,7 +3331,7 @@
                 <w:sz w:val="20"/>
                 <w:szCs w:val="20"/>
               </w:rPr>
-              <w:t xml:space="preserve">  (Актуальность и цель работы)</w:t>
+              <w:t xml:space="preserve">  (Актуальность темы)</w:t>
             </w:r>
           </w:p>
           <w:p>
@@ -2981,7 +3344,7 @@
                 <w:sz w:val="28"/>
                 <w:szCs w:val="28"/>
               </w:rPr>
-              <w:t xml:space="preserve">At cruising level, radiation levels are much higher than on the ground. As early as 1990, the International Commission on Radiological Protection recognised this exposure of aircrew as occupational. In my previous work I measured radiation levels on board an aircraft with a home-made Geiger counter. Now we look at the topic from the legal side. The aim of our work is to examine how Russian law regulates the exposure of aircrew to cosmic radiation. We answer three questions: which rules limit crew exposure, who must keep a record of the dose, and what has changed in the law in recent years.</w:t>
+              <w:t xml:space="preserve">Why is this topic important? At cruising level, radiation is 11 to 22 times higher than on the ground. Since 1990, international experts have treated this exposure as part of the job. Special sanitary rules for aircrew were cancelled in 2021 and 2025. And with 900 flight hours a year, the dose can reach about 3.6 millisieverts. That is more than 70 percent of the limit. So our question is simple: does the law really protect each crew member?</w:t>
             </w:r>
           </w:p>
           <w:p>
@@ -3099,7 +3462,7 @@
                 <w:sz w:val="20"/>
                 <w:szCs w:val="20"/>
               </w:rPr>
-              <w:t xml:space="preserve">0:45</w:t>
+              <w:t xml:space="preserve">0:30</w:t>
             </w:r>
           </w:p>
         </w:tc>
@@ -3133,7 +3496,7 @@
                 <w:sz w:val="24"/>
                 <w:szCs w:val="24"/>
               </w:rPr>
-              <w:t xml:space="preserve">Measurements on Board: Results of the Previous Work</w:t>
+              <w:t xml:space="preserve">Aim and Tasks</w:t>
             </w:r>
             <w:r>
               <w:rPr>
@@ -3144,7 +3507,7 @@
                 <w:sz w:val="20"/>
                 <w:szCs w:val="20"/>
               </w:rPr>
-              <w:t xml:space="preserve">  (Измерения на борту: результаты предыдущей работы)</w:t>
+              <w:t xml:space="preserve">  (Цель и задачи исследования)</w:t>
             </w:r>
           </w:p>
           <w:p>
@@ -3157,7 +3520,7 @@
                 <w:sz w:val="28"/>
                 <w:szCs w:val="28"/>
               </w:rPr>
-              <w:t xml:space="preserve">Let me briefly recall the results. The measurements were taken on two flights at roughly the same latitudes: Novokuznetsk – Irkutsk and Yekaterinburg – Chita. The counter was in the cockpit, and readings were taken before take-off, at cruising level and after landing. Near the ground the average readings were about 8 to 15 microroentgens per hour; at 33 to 35 thousand feet they were 170 to 184. So at cruising level the readings were 11 to 22 times higher — on average about 16 times.</w:t>
+              <w:t xml:space="preserve">Our aim is to find gaps in the law and to suggest how to close them. We used legal analysis, history of the law and comparison with foreign law. We had four tasks: to study the current rules, to see how they changed, to compare them with the European Union and Germany, and to make proposals.</w:t>
             </w:r>
           </w:p>
           <w:p>
@@ -3309,7 +3672,7 @@
                 <w:sz w:val="24"/>
                 <w:szCs w:val="24"/>
               </w:rPr>
-              <w:t xml:space="preserve">Recording the Readings: Novokuznetsk – Irkutsk Flight</w:t>
+              <w:t xml:space="preserve">Measurements on Board</w:t>
             </w:r>
             <w:r>
               <w:rPr>
@@ -3320,7 +3683,7 @@
                 <w:sz w:val="20"/>
                 <w:szCs w:val="20"/>
               </w:rPr>
-              <w:t xml:space="preserve">  (Регистрация показаний: рейс Новокузнецк – Иркутск)</w:t>
+              <w:t xml:space="preserve">  (Измерения на борту)</w:t>
             </w:r>
           </w:p>
           <w:p>
@@ -3333,7 +3696,7 @@
                 <w:sz w:val="28"/>
                 <w:szCs w:val="28"/>
               </w:rPr>
-              <w:t xml:space="preserve">Here you can see single readings on the Novokuznetsk – Irkutsk flight: 13.2 microroentgens per hour before take-off, almost 195 at flight level three-five-zero near waypoint NILRA, and 9.9 after landing in Irkutsk. These are single readings, so they differ slightly from the averages in the table. On the right you can see waypoint NILRA on the cockpit displays and in the computer flight plan.</w:t>
+              <w:t xml:space="preserve">First, a few facts from my previous work. I measured radiation on two flights with a home-made Geiger counter. Near the ground the device showed about 8 to 15 microroentgens per hour. At cruising level it showed 170 to 184. But a Geiger counter does not see neutrons, and neutrons give a large part of the dose. So the real annual dose must be calculated, not just measured.</w:t>
             </w:r>
           </w:p>
           <w:p>
@@ -3451,7 +3814,7 @@
                 <w:sz w:val="20"/>
                 <w:szCs w:val="20"/>
               </w:rPr>
-              <w:t xml:space="preserve">0:50</w:t>
+              <w:t xml:space="preserve">0:15</w:t>
             </w:r>
           </w:p>
         </w:tc>
@@ -3485,7 +3848,7 @@
                 <w:sz w:val="24"/>
                 <w:szCs w:val="24"/>
               </w:rPr>
-              <w:t xml:space="preserve">Why the Annual Dose Must Be Calculated</w:t>
+              <w:t xml:space="preserve">Readings on the Flight</w:t>
             </w:r>
             <w:r>
               <w:rPr>
@@ -3496,7 +3859,7 @@
                 <w:sz w:val="20"/>
                 <w:szCs w:val="20"/>
               </w:rPr>
-              <w:t xml:space="preserve">  (Почему годовую дозу нужно рассчитывать)</w:t>
+              <w:t xml:space="preserve">  (Показания на рейсе Новокузнецк – Иркутск)</w:t>
             </w:r>
           </w:p>
           <w:p>
@@ -3509,7 +3872,7 @@
                 <w:sz w:val="28"/>
                 <w:szCs w:val="28"/>
               </w:rPr>
-              <w:t xml:space="preserve">However, these readings alone are not enough to estimate the annual dose. A Geiger counter is designed mainly for gamma and beta radiation and hardly detects neutrons. But at altitude, neutrons give a large part of the dose. That is why a crew member’s annual dose is calculated from actual routes, altitudes and flight dates — with software such as CARI-7 or with the Russian model RUSCOSMICS. This leads to the main question of our work: who in Russia must keep a record of this dose, and which legal rules set out this duty? Ilya will continue.</w:t>
+              <w:t xml:space="preserve">Here are the readings on the Novokuznetsk – Irkutsk flight: 13.2 before take-off, about 195 at flight level three-five-zero, and 9.9 after landing. Now Ilya will explain how the law regulates this.</w:t>
             </w:r>
           </w:p>
           <w:p>
@@ -3520,15 +3883,15 @@
             <w:r>
               <w:rPr>
                 <w:rFonts w:ascii="Times New Roman" w:cs="Times New Roman" w:eastAsia="Times New Roman" w:hAnsi="Times New Roman"/>
-                <w:b/>
-                <w:bCs/>
-                <w:i w:val="false"/>
-                <w:iCs w:val="false"/>
-                <w:color w:val="000000"/>
-                <w:sz w:val="22"/>
-                <w:szCs w:val="22"/>
-              </w:rPr>
-              <w:t xml:space="preserve">► ILYA continues  ·  [Next slide]</w:t>
+                <w:b w:val="false"/>
+                <w:bCs w:val="false"/>
+                <w:i/>
+                <w:iCs/>
+                <w:color w:val="595959"/>
+                <w:sz w:val="22"/>
+                <w:szCs w:val="22"/>
+              </w:rPr>
+              <w:t xml:space="preserve">[Next slide]</w:t>
             </w:r>
           </w:p>
         </w:tc>
@@ -3628,7 +3991,7 @@
                 <w:sz w:val="20"/>
                 <w:szCs w:val="20"/>
               </w:rPr>
-              <w:t xml:space="preserve">0:50</w:t>
+              <w:t xml:space="preserve">0:40</w:t>
             </w:r>
           </w:p>
         </w:tc>
@@ -3663,7 +4026,7 @@
                 <w:sz w:val="24"/>
                 <w:szCs w:val="24"/>
               </w:rPr>
-              <w:t xml:space="preserve">Legal Basis and the Crew Dose Limit</w:t>
+              <w:t xml:space="preserve">Current Legal Regulation</w:t>
             </w:r>
             <w:r>
               <w:rPr>
@@ -3674,7 +4037,7 @@
                 <w:sz w:val="20"/>
                 <w:szCs w:val="20"/>
               </w:rPr>
-              <w:t xml:space="preserve">  (Правовая основа и предел дозы облучения экипажа)</w:t>
+              <w:t xml:space="preserve">  (Действующее правовое регулирование)</w:t>
             </w:r>
           </w:p>
           <w:p>
@@ -3687,7 +4050,7 @@
                 <w:sz w:val="28"/>
                 <w:szCs w:val="28"/>
               </w:rPr>
-              <w:t xml:space="preserve">Thank you, Nikita. Regulation is based on two federal laws: No. 3-FZ “On Radiation Safety of the Population” and No. 52-FZ “On the Sanitary and Epidemiological Welfare of the Population”. The dose limit itself is set by the Radiation Safety Standards, NRB-99/2009. Under clause 4.1, a worker’s effective dose from natural radiation sources under occupational conditions must not exceed 5 millisieverts per year. Clause 4.3 applies this rule directly to aircraft crews. Under Article 56 of the Air Code, the crew consists of the flight crew and the cabin crew, so the limit covers both pilots and flight attendants.</w:t>
+              <w:t xml:space="preserve">Thank you, Nikita. This diagram shows the current system. At the top are federal laws: the law on radiation safety, the Air Code and the Labour Code. Below them are three groups of rules. The radiation safety standards set the limit: 5 millisieverts a year. The Ministry of Labour sets the rules for checking working conditions. The Ministry of Transport limits flight time. But nobody is told who must calculate the dose of each person.</w:t>
             </w:r>
           </w:p>
           <w:p>
@@ -3806,7 +4169,7 @@
                 <w:sz w:val="20"/>
                 <w:szCs w:val="20"/>
               </w:rPr>
-              <w:t xml:space="preserve">0:40</w:t>
+              <w:t xml:space="preserve">0:35</w:t>
             </w:r>
           </w:p>
         </w:tc>
@@ -3841,7 +4204,7 @@
                 <w:sz w:val="24"/>
                 <w:szCs w:val="24"/>
               </w:rPr>
-              <w:t xml:space="preserve">Changes in Sanitary Rules in 2021–2025</w:t>
+              <w:t xml:space="preserve">How the Rules Changed</w:t>
             </w:r>
             <w:r>
               <w:rPr>
@@ -3852,7 +4215,7 @@
                 <w:sz w:val="20"/>
                 <w:szCs w:val="20"/>
               </w:rPr>
-              <w:t xml:space="preserve">  (Изменения санитарных норм в 2021–2025 годах)</w:t>
+              <w:t xml:space="preserve">  (Изменения специального регулирования)</w:t>
             </w:r>
           </w:p>
           <w:p>
@@ -3865,7 +4228,7 @@
                 <w:sz w:val="28"/>
                 <w:szCs w:val="28"/>
               </w:rPr>
-              <w:t xml:space="preserve">Nikita’s previous work cited two sets of sanitary rules — the SanPiNs of 2008 and 2010 shown on the slide. Both are no longer in force. The first ceased to apply on 1 January 2021, and the second on 1 September 2025, when a new SanPiN came into force. Still, the limit of 5 millisieverts per year remains in NRB-99/2009, and Article 18 of Federal Law No. 3-FZ provides for monitoring and recording of individual doses through a single state system.</w:t>
+              <w:t xml:space="preserve">This table shows how the rules changed. Two sanitary rules had special parts about aircrew. The first was cancelled in 2021, the second in 2025. Only one short clause is left. It says that aircrew exposure is limited to 5 millisieverts a year. So the limit is still there, but the rules on how to keep to it are gone.</w:t>
             </w:r>
           </w:p>
           <w:p>
@@ -4019,7 +4382,7 @@
                 <w:sz w:val="24"/>
                 <w:szCs w:val="24"/>
               </w:rPr>
-              <w:t xml:space="preserve">Employer’s Duties and the Special Assessment of Working Conditions</w:t>
+              <w:t xml:space="preserve">Gaps in the Law (1)</w:t>
             </w:r>
             <w:r>
               <w:rPr>
@@ -4030,7 +4393,7 @@
                 <w:sz w:val="20"/>
                 <w:szCs w:val="20"/>
               </w:rPr>
-              <w:t xml:space="preserve">  (Обязанности работодателя и специальная оценка условий труда)</w:t>
+              <w:t xml:space="preserve">  (Выявленные пробелы (1))</w:t>
             </w:r>
           </w:p>
           <w:p>
@@ -4043,7 +4406,7 @@
                 <w:sz w:val="28"/>
                 <w:szCs w:val="28"/>
               </w:rPr>
-              <w:t xml:space="preserve">Under Article 214 of the Labour Code, the airline as the employer must ensure safe working conditions. Since 1 March 2025, Order No. 255n of the Ministry of Labour has set specific rules for the special assessment of working conditions of flight and cabin crews. As a general rule, harmful factors are measured during a special control flight. But this assessment describes the workplace, not the dose that a particular person receives over a year on different routes.</w:t>
+              <w:t xml:space="preserve">We found several gaps. First, apart from that one clause, we did not find any special rules for aircrew. Second, the law does not say who must calculate the dose of each crew member, or how. Third, the Federal Law requires records of individual doses, but we did not find a way for crew doses to get into the state dose register. As a result, nobody can check if a person stays under the limit.</w:t>
             </w:r>
           </w:p>
           <w:p>
@@ -4197,7 +4560,7 @@
                 <w:sz w:val="24"/>
                 <w:szCs w:val="24"/>
               </w:rPr>
-              <w:t xml:space="preserve">System of Legal Regulation</w:t>
+              <w:t xml:space="preserve">Gaps in the Law (2)</w:t>
             </w:r>
             <w:r>
               <w:rPr>
@@ -4208,7 +4571,7 @@
                 <w:sz w:val="20"/>
                 <w:szCs w:val="20"/>
               </w:rPr>
-              <w:t xml:space="preserve">  (Система правового регулирования)</w:t>
+              <w:t xml:space="preserve">  (Выявленные пробелы (2))</w:t>
             </w:r>
           </w:p>
           <w:p>
@@ -4221,7 +4584,7 @@
                 <w:sz w:val="28"/>
                 <w:szCs w:val="28"/>
               </w:rPr>
-              <w:t xml:space="preserve">This diagram shows the whole system. Federal laws, including the Air Code and the Labour Code, form the framework. Below them, the radiation safety standards set the dose limit, an order of the Ministry of Labour regulates the assessment of working conditions, and an order of the Ministry of Transport limits flight time. Two sets of sanitary rules have been repealed, and a special procedure for calculating each crew member’s dose from actual flights has still not been established. Now Nikita will talk about flight time and the annual dose.</w:t>
+              <w:t xml:space="preserve">There are more gaps. The check of working conditions is done during one test flight. It cannot show the dose for a whole year on different routes. Flight time limits — 800 hours, or 900 with consent — do not take the dose into account. A crew member agrees to fly more without knowing his or her dose. Nobody has to tell a worker their personal dose. And there is no special dose rule for pregnant crew members. Nikita will now talk about foreign experience.</w:t>
             </w:r>
           </w:p>
           <w:p>
@@ -4232,15 +4595,15 @@
             <w:r>
               <w:rPr>
                 <w:rFonts w:ascii="Times New Roman" w:cs="Times New Roman" w:eastAsia="Times New Roman" w:hAnsi="Times New Roman"/>
-                <w:b/>
-                <w:bCs/>
-                <w:i w:val="false"/>
-                <w:iCs w:val="false"/>
-                <w:color w:val="000000"/>
-                <w:sz w:val="22"/>
-                <w:szCs w:val="22"/>
-              </w:rPr>
-              <w:t xml:space="preserve">► NIKITA continues  ·  [Next slide]</w:t>
+                <w:b w:val="false"/>
+                <w:bCs w:val="false"/>
+                <w:i/>
+                <w:iCs/>
+                <w:color w:val="595959"/>
+                <w:sz w:val="22"/>
+                <w:szCs w:val="22"/>
+              </w:rPr>
+              <w:t xml:space="preserve">[Next slide]</w:t>
             </w:r>
           </w:p>
         </w:tc>
@@ -4339,7 +4702,7 @@
                 <w:sz w:val="20"/>
                 <w:szCs w:val="20"/>
               </w:rPr>
-              <w:t xml:space="preserve">0:50</w:t>
+              <w:t xml:space="preserve">0:40</w:t>
             </w:r>
           </w:p>
         </w:tc>
@@ -4373,7 +4736,7 @@
                 <w:sz w:val="24"/>
                 <w:szCs w:val="24"/>
               </w:rPr>
-              <w:t xml:space="preserve">Flight Time Limits and Annual Dose Estimate</w:t>
+              <w:t xml:space="preserve">Foreign Experience</w:t>
             </w:r>
             <w:r>
               <w:rPr>
@@ -4384,7 +4747,7 @@
                 <w:sz w:val="20"/>
                 <w:szCs w:val="20"/>
               </w:rPr>
-              <w:t xml:space="preserve">  (Ограничение налёта и оценка годовой дозы)</w:t>
+              <w:t xml:space="preserve">  (Зарубежный опыт)</w:t>
             </w:r>
           </w:p>
           <w:p>
@@ -4397,7 +4760,7 @@
                 <w:sz w:val="28"/>
                 <w:szCs w:val="28"/>
               </w:rPr>
-              <w:t xml:space="preserve">Thank you, Ilya. On 1 March 2026, Order No. 381 of the Ministry of Transport replaced Order No. 139. Flight time must not exceed 800 hours a year, or 900 hours with the employee’s written consent. What dose does this give? Russian researchers calculated that flight crew receive about 362 microsieverts per month with 90 flight hours — about 4 microsieverts per flight hour. So 800 hours give about 3.2 millisieverts, and 900 hours about 3.6 millisieverts a year — more than 70 percent of the limit. On high-latitude routes and during solar flares the dose rate is even higher.</w:t>
+              <w:t xml:space="preserve">Thank you, Ilya. In the European Union and in Germany the system is different. If a crew member may get more than 1 millisievert a year, the airline must calculate the dose. It must take the dose into account in work schedules. It must tell the worker his or her dose. For a pregnant crew member, the dose to the baby must not be more than 1 millisievert. In Russia these rules do not exist yet.</w:t>
             </w:r>
           </w:p>
           <w:p>
@@ -4549,7 +4912,7 @@
                 <w:sz w:val="24"/>
                 <w:szCs w:val="24"/>
               </w:rPr>
-              <w:t xml:space="preserve">International Experience</w:t>
+              <w:t xml:space="preserve">Our Proposals (1)</w:t>
             </w:r>
             <w:r>
               <w:rPr>
@@ -4560,7 +4923,7 @@
                 <w:sz w:val="20"/>
                 <w:szCs w:val="20"/>
               </w:rPr>
-              <w:t xml:space="preserve">  (Международный опыт)</w:t>
+              <w:t xml:space="preserve">  (Предложения по совершенствованию (1))</w:t>
             </w:r>
           </w:p>
           <w:p>
@@ -4573,7 +4936,7 @@
                 <w:sz w:val="28"/>
                 <w:szCs w:val="28"/>
               </w:rPr>
-              <w:t xml:space="preserve">For comparison, the ICRP recommends choosing a reference level for aircrew in the range of 5 to 10 millisieverts per year. In the European Union, Article 35(3) of Council Directive 2013/59/Euratom requires Member States to ensure the following: if crew members are likely to receive more than 1 millisievert a year, the airline must assess their exposure, take it into account when planning work schedules, and inform the workers about their doses. In the Russian acts we examined there is no such special procedure. Ilya will present our conclusions.</w:t>
+              <w:t xml:space="preserve">So what do we propose? First, the sanitary rules should say: if a crew member may get more than 1 millisievert a year, the airline must calculate the personal dose, appoint a responsible person and keep records. Second, there should be a control level below the limit. When a person reaches it, the airline must change his or her schedule. Third, the sanitary service should approve one method to calculate the dose from real routes, flight levels and flight time. Ilya will continue.</w:t>
             </w:r>
           </w:p>
           <w:p>
@@ -4584,15 +4947,15 @@
             <w:r>
               <w:rPr>
                 <w:rFonts w:ascii="Times New Roman" w:cs="Times New Roman" w:eastAsia="Times New Roman" w:hAnsi="Times New Roman"/>
-                <w:b/>
-                <w:bCs/>
-                <w:i w:val="false"/>
-                <w:iCs w:val="false"/>
-                <w:color w:val="000000"/>
-                <w:sz w:val="22"/>
-                <w:szCs w:val="22"/>
-              </w:rPr>
-              <w:t xml:space="preserve">► ILYA continues  ·  [Next slide]</w:t>
+                <w:b w:val="false"/>
+                <w:bCs w:val="false"/>
+                <w:i/>
+                <w:iCs/>
+                <w:color w:val="595959"/>
+                <w:sz w:val="22"/>
+                <w:szCs w:val="22"/>
+              </w:rPr>
+              <w:t xml:space="preserve">[Next slide]</w:t>
             </w:r>
           </w:p>
         </w:tc>
@@ -4727,7 +5090,7 @@
                 <w:sz w:val="24"/>
                 <w:szCs w:val="24"/>
               </w:rPr>
-              <w:t xml:space="preserve">Conclusions</w:t>
+              <w:t xml:space="preserve">Our Proposals (2)</w:t>
             </w:r>
             <w:r>
               <w:rPr>
@@ -4738,7 +5101,7 @@
                 <w:sz w:val="20"/>
                 <w:szCs w:val="20"/>
               </w:rPr>
-              <w:t xml:space="preserve">  (Выводы)</w:t>
+              <w:t xml:space="preserve">  (Предложения по совершенствованию (2))</w:t>
             </w:r>
           </w:p>
           <w:p>
@@ -4751,7 +5114,7 @@
                 <w:sz w:val="28"/>
                 <w:szCs w:val="28"/>
               </w:rPr>
-              <w:t xml:space="preserve">To sum up. First, crew exposure in Russia is regulated: the limit of 5 millisieverts per year under clauses 4.1 and 4.3 of NRB-99/2009 has remained in force after the special sanitary rules were repealed. Second, the special assessment of working conditions and flight time limits do not replace individual dose records: by our estimate, 900 flight hours may give more than 70 percent of the limit. Third, we propose to establish a procedure for calculating individual doses from actual flights, informing employees and taking doses into account when planning schedules, as is already done in EU law.</w:t>
+              <w:t xml:space="preserve">We also propose four more steps. Crew doses should go into the state dose register, and each worker should get his or her dose every year. The order of the Ministry of Transport should include the dose in work schedules. A crew member should agree to 900 hours only after he or she knows his or her dose. A pregnant crew member should be able to move to ground work or to low-dose flights. And the rules for checking working conditions should include cosmic radiation when they are revised before 2029.</w:t>
             </w:r>
           </w:p>
           <w:p>
@@ -4870,7 +5233,7 @@
                 <w:sz w:val="20"/>
                 <w:szCs w:val="20"/>
               </w:rPr>
-              <w:t xml:space="preserve">0:10</w:t>
+              <w:t xml:space="preserve">0:30</w:t>
             </w:r>
           </w:p>
         </w:tc>
@@ -4905,7 +5268,7 @@
                 <w:sz w:val="24"/>
                 <w:szCs w:val="24"/>
               </w:rPr>
-              <w:t xml:space="preserve">References</w:t>
+              <w:t xml:space="preserve">Conclusions</w:t>
             </w:r>
             <w:r>
               <w:rPr>
@@ -4916,7 +5279,7 @@
                 <w:sz w:val="20"/>
                 <w:szCs w:val="20"/>
               </w:rPr>
-              <w:t xml:space="preserve">  (Список использованных источников)</w:t>
+              <w:t xml:space="preserve">  (Выводы)</w:t>
             </w:r>
           </w:p>
           <w:p>
@@ -4929,7 +5292,7 @@
                 <w:sz w:val="28"/>
                 <w:szCs w:val="28"/>
               </w:rPr>
-              <w:t xml:space="preserve">The list of sources is shown on this slide.</w:t>
+              <w:t xml:space="preserve">To sum up. Russia has a dose limit for aircrew: 5 millisieverts a year. But the law does not say how to keep to this limit. After the special rules were cancelled, nobody has to calculate and record the dose of each crew member. We propose to fix this, using the European rules as a model.</w:t>
             </w:r>
           </w:p>
           <w:p>
@@ -5048,7 +5411,7 @@
                 <w:sz w:val="20"/>
                 <w:szCs w:val="20"/>
               </w:rPr>
-              <w:t xml:space="preserve">0:10</w:t>
+              <w:t xml:space="preserve">0:05</w:t>
             </w:r>
           </w:p>
         </w:tc>
@@ -5083,7 +5446,7 @@
                 <w:sz w:val="24"/>
                 <w:szCs w:val="24"/>
               </w:rPr>
-              <w:t xml:space="preserve">Thank You</w:t>
+              <w:t xml:space="preserve">References</w:t>
             </w:r>
             <w:r>
               <w:rPr>
@@ -5094,7 +5457,7 @@
                 <w:sz w:val="20"/>
                 <w:szCs w:val="20"/>
               </w:rPr>
-              <w:t xml:space="preserve">  (Спасибо за внимание!)</w:t>
+              <w:t xml:space="preserve">  (Список использованных источников)</w:t>
             </w:r>
           </w:p>
           <w:p>
@@ -5107,7 +5470,363 @@
                 <w:sz w:val="28"/>
                 <w:szCs w:val="28"/>
               </w:rPr>
-              <w:t xml:space="preserve">Thank you for your attention! We are ready to answer your questions.</w:t>
+              <w:t xml:space="preserve">Here is the list of our sources.</w:t>
+            </w:r>
+          </w:p>
+          <w:p>
+            <w:pPr>
+              <w:spacing w:after="0" w:before="0" w:line="312"/>
+              <w:jc w:val="right"/>
+            </w:pPr>
+            <w:r>
+              <w:rPr>
+                <w:rFonts w:ascii="Times New Roman" w:cs="Times New Roman" w:eastAsia="Times New Roman" w:hAnsi="Times New Roman"/>
+                <w:b w:val="false"/>
+                <w:bCs w:val="false"/>
+                <w:i/>
+                <w:iCs/>
+                <w:color w:val="595959"/>
+                <w:sz w:val="22"/>
+                <w:szCs w:val="22"/>
+              </w:rPr>
+              <w:t xml:space="preserve">[Next slide]</w:t>
+            </w:r>
+          </w:p>
+        </w:tc>
+      </w:tr>
+    </w:tbl>
+    <w:p>
+      <w:pPr>
+        <w:spacing w:after="60" w:before="0" w:line="240"/>
+      </w:pPr>
+      <w:r>
+        <w:rPr>
+          <w:rFonts w:ascii="Times New Roman" w:cs="Times New Roman" w:eastAsia="Times New Roman" w:hAnsi="Times New Roman"/>
+          <w:sz w:val="28"/>
+          <w:szCs w:val="28"/>
+        </w:rPr>
+        <w:t xml:space="preserve"/>
+      </w:r>
+    </w:p>
+    <w:tbl>
+      <w:tblPr>
+        <w:tblW w:type="dxa" w:w="9638"/>
+        <w:tblBorders>
+          <w:top w:val="single" w:color="auto" w:sz="4"/>
+          <w:left w:val="single" w:color="auto" w:sz="4"/>
+          <w:bottom w:val="single" w:color="auto" w:sz="4"/>
+          <w:right w:val="single" w:color="auto" w:sz="4"/>
+          <w:insideH w:val="single" w:color="auto" w:sz="4"/>
+          <w:insideV w:val="single" w:color="auto" w:sz="4"/>
+        </w:tblBorders>
+        <w:tblLayout w:type="fixed"/>
+      </w:tblPr>
+      <w:tblGrid>
+        <w:gridCol w:w="1650"/>
+        <w:gridCol w:w="7988"/>
+      </w:tblGrid>
+      <w:tr>
+        <w:trPr>
+          <w:cantSplit/>
+        </w:trPr>
+        <w:tc>
+          <w:tcPr>
+            <w:tcW w:type="dxa" w:w="1650"/>
+            <w:tcBorders>
+              <w:top w:val="single" w:color="000000" w:sz="4"/>
+              <w:left w:val="single" w:color="000000" w:sz="4"/>
+              <w:bottom w:val="single" w:color="000000" w:sz="4"/>
+              <w:right w:val="single" w:color="000000" w:sz="4"/>
+            </w:tcBorders>
+            <w:shd w:fill="E7E6E6" w:color="auto" w:val="clear"/>
+            <w:tcMar>
+              <w:top w:type="dxa" w:w="100"/>
+              <w:left w:type="dxa" w:w="140"/>
+              <w:bottom w:type="dxa" w:w="100"/>
+              <w:right w:type="dxa" w:w="140"/>
+            </w:tcMar>
+            <w:vAlign w:val="top"/>
+          </w:tcPr>
+          <w:p>
+            <w:pPr>
+              <w:spacing w:after="40" w:before="0" w:line="312"/>
+            </w:pPr>
+            <w:r>
+              <w:rPr>
+                <w:rFonts w:ascii="Times New Roman" w:cs="Times New Roman" w:eastAsia="Times New Roman" w:hAnsi="Times New Roman"/>
+                <w:b/>
+                <w:bCs/>
+                <w:color w:val="404040"/>
+                <w:sz w:val="20"/>
+                <w:szCs w:val="20"/>
+              </w:rPr>
+              <w:t xml:space="preserve">SLIDE 15</w:t>
+            </w:r>
+          </w:p>
+          <w:p>
+            <w:pPr>
+              <w:spacing w:after="40" w:before="0" w:line="312"/>
+            </w:pPr>
+            <w:r>
+              <w:rPr>
+                <w:rFonts w:ascii="Times New Roman" w:cs="Times New Roman" w:eastAsia="Times New Roman" w:hAnsi="Times New Roman"/>
+                <w:b/>
+                <w:bCs/>
+                <w:sz w:val="30"/>
+                <w:szCs w:val="30"/>
+              </w:rPr>
+              <w:t xml:space="preserve">ILYA</w:t>
+            </w:r>
+          </w:p>
+          <w:p>
+            <w:pPr>
+              <w:spacing w:after="0" w:before="0" w:line="312"/>
+            </w:pPr>
+            <w:r>
+              <w:rPr>
+                <w:rFonts w:ascii="Times New Roman" w:cs="Times New Roman" w:eastAsia="Times New Roman" w:hAnsi="Times New Roman"/>
+                <w:color w:val="404040"/>
+                <w:sz w:val="20"/>
+                <w:szCs w:val="20"/>
+              </w:rPr>
+              <w:t xml:space="preserve">0:05</w:t>
+            </w:r>
+          </w:p>
+        </w:tc>
+        <w:tc>
+          <w:tcPr>
+            <w:tcW w:type="dxa" w:w="7988"/>
+            <w:tcBorders>
+              <w:top w:val="single" w:color="000000" w:sz="4"/>
+              <w:left w:val="single" w:color="000000" w:sz="4"/>
+              <w:bottom w:val="single" w:color="000000" w:sz="4"/>
+              <w:right w:val="single" w:color="000000" w:sz="4"/>
+            </w:tcBorders>
+            <w:shd w:fill="E7E6E6" w:color="auto" w:val="clear"/>
+            <w:tcMar>
+              <w:top w:type="dxa" w:w="100"/>
+              <w:left w:type="dxa" w:w="140"/>
+              <w:bottom w:type="dxa" w:w="100"/>
+              <w:right w:type="dxa" w:w="140"/>
+            </w:tcMar>
+            <w:vAlign w:val="top"/>
+          </w:tcPr>
+          <w:p>
+            <w:pPr>
+              <w:keepNext/>
+              <w:spacing w:after="80" w:before="0" w:line="312"/>
+            </w:pPr>
+            <w:r>
+              <w:rPr>
+                <w:rFonts w:ascii="Times New Roman" w:cs="Times New Roman" w:eastAsia="Times New Roman" w:hAnsi="Times New Roman"/>
+                <w:b/>
+                <w:bCs/>
+                <w:sz w:val="24"/>
+                <w:szCs w:val="24"/>
+              </w:rPr>
+              <w:t xml:space="preserve">References (continued)</w:t>
+            </w:r>
+            <w:r>
+              <w:rPr>
+                <w:rFonts w:ascii="Times New Roman" w:cs="Times New Roman" w:eastAsia="Times New Roman" w:hAnsi="Times New Roman"/>
+                <w:i/>
+                <w:iCs/>
+                <w:color w:val="404040"/>
+                <w:sz w:val="20"/>
+                <w:szCs w:val="20"/>
+              </w:rPr>
+              <w:t xml:space="preserve">  (Список использованных источников)</w:t>
+            </w:r>
+          </w:p>
+          <w:p>
+            <w:pPr>
+              <w:spacing w:after="80" w:before="0" w:line="360"/>
+            </w:pPr>
+            <w:r>
+              <w:rPr>
+                <w:rFonts w:ascii="Times New Roman" w:cs="Times New Roman" w:eastAsia="Times New Roman" w:hAnsi="Times New Roman"/>
+                <w:sz w:val="28"/>
+                <w:szCs w:val="28"/>
+              </w:rPr>
+              <w:t xml:space="preserve">And the rest of the list.</w:t>
+            </w:r>
+          </w:p>
+          <w:p>
+            <w:pPr>
+              <w:spacing w:after="0" w:before="0" w:line="312"/>
+              <w:jc w:val="right"/>
+            </w:pPr>
+            <w:r>
+              <w:rPr>
+                <w:rFonts w:ascii="Times New Roman" w:cs="Times New Roman" w:eastAsia="Times New Roman" w:hAnsi="Times New Roman"/>
+                <w:b w:val="false"/>
+                <w:bCs w:val="false"/>
+                <w:i/>
+                <w:iCs/>
+                <w:color w:val="595959"/>
+                <w:sz w:val="22"/>
+                <w:szCs w:val="22"/>
+              </w:rPr>
+              <w:t xml:space="preserve">[Next slide]</w:t>
+            </w:r>
+          </w:p>
+        </w:tc>
+      </w:tr>
+    </w:tbl>
+    <w:p>
+      <w:pPr>
+        <w:spacing w:after="60" w:before="0" w:line="240"/>
+      </w:pPr>
+      <w:r>
+        <w:rPr>
+          <w:rFonts w:ascii="Times New Roman" w:cs="Times New Roman" w:eastAsia="Times New Roman" w:hAnsi="Times New Roman"/>
+          <w:sz w:val="28"/>
+          <w:szCs w:val="28"/>
+        </w:rPr>
+        <w:t xml:space="preserve"/>
+      </w:r>
+    </w:p>
+    <w:tbl>
+      <w:tblPr>
+        <w:tblW w:type="dxa" w:w="9638"/>
+        <w:tblBorders>
+          <w:top w:val="single" w:color="auto" w:sz="4"/>
+          <w:left w:val="single" w:color="auto" w:sz="4"/>
+          <w:bottom w:val="single" w:color="auto" w:sz="4"/>
+          <w:right w:val="single" w:color="auto" w:sz="4"/>
+          <w:insideH w:val="single" w:color="auto" w:sz="4"/>
+          <w:insideV w:val="single" w:color="auto" w:sz="4"/>
+        </w:tblBorders>
+        <w:tblLayout w:type="fixed"/>
+      </w:tblPr>
+      <w:tblGrid>
+        <w:gridCol w:w="1650"/>
+        <w:gridCol w:w="7988"/>
+      </w:tblGrid>
+      <w:tr>
+        <w:trPr>
+          <w:cantSplit/>
+        </w:trPr>
+        <w:tc>
+          <w:tcPr>
+            <w:tcW w:type="dxa" w:w="1650"/>
+            <w:tcBorders>
+              <w:top w:val="single" w:color="000000" w:sz="4"/>
+              <w:left w:val="single" w:color="000000" w:sz="4"/>
+              <w:bottom w:val="single" w:color="000000" w:sz="4"/>
+              <w:right w:val="single" w:color="000000" w:sz="4"/>
+            </w:tcBorders>
+            <w:shd w:fill="E7E6E6" w:color="auto" w:val="clear"/>
+            <w:tcMar>
+              <w:top w:type="dxa" w:w="100"/>
+              <w:left w:type="dxa" w:w="140"/>
+              <w:bottom w:type="dxa" w:w="100"/>
+              <w:right w:type="dxa" w:w="140"/>
+            </w:tcMar>
+            <w:vAlign w:val="top"/>
+          </w:tcPr>
+          <w:p>
+            <w:pPr>
+              <w:spacing w:after="40" w:before="0" w:line="312"/>
+            </w:pPr>
+            <w:r>
+              <w:rPr>
+                <w:rFonts w:ascii="Times New Roman" w:cs="Times New Roman" w:eastAsia="Times New Roman" w:hAnsi="Times New Roman"/>
+                <w:b/>
+                <w:bCs/>
+                <w:color w:val="404040"/>
+                <w:sz w:val="20"/>
+                <w:szCs w:val="20"/>
+              </w:rPr>
+              <w:t xml:space="preserve">SLIDE 16</w:t>
+            </w:r>
+          </w:p>
+          <w:p>
+            <w:pPr>
+              <w:spacing w:after="40" w:before="0" w:line="312"/>
+            </w:pPr>
+            <w:r>
+              <w:rPr>
+                <w:rFonts w:ascii="Times New Roman" w:cs="Times New Roman" w:eastAsia="Times New Roman" w:hAnsi="Times New Roman"/>
+                <w:b/>
+                <w:bCs/>
+                <w:sz w:val="30"/>
+                <w:szCs w:val="30"/>
+              </w:rPr>
+              <w:t xml:space="preserve">ILYA</w:t>
+            </w:r>
+          </w:p>
+          <w:p>
+            <w:pPr>
+              <w:spacing w:after="0" w:before="0" w:line="312"/>
+            </w:pPr>
+            <w:r>
+              <w:rPr>
+                <w:rFonts w:ascii="Times New Roman" w:cs="Times New Roman" w:eastAsia="Times New Roman" w:hAnsi="Times New Roman"/>
+                <w:color w:val="404040"/>
+                <w:sz w:val="20"/>
+                <w:szCs w:val="20"/>
+              </w:rPr>
+              <w:t xml:space="preserve">0:05</w:t>
+            </w:r>
+          </w:p>
+        </w:tc>
+        <w:tc>
+          <w:tcPr>
+            <w:tcW w:type="dxa" w:w="7988"/>
+            <w:tcBorders>
+              <w:top w:val="single" w:color="000000" w:sz="4"/>
+              <w:left w:val="single" w:color="000000" w:sz="4"/>
+              <w:bottom w:val="single" w:color="000000" w:sz="4"/>
+              <w:right w:val="single" w:color="000000" w:sz="4"/>
+            </w:tcBorders>
+            <w:shd w:fill="E7E6E6" w:color="auto" w:val="clear"/>
+            <w:tcMar>
+              <w:top w:type="dxa" w:w="100"/>
+              <w:left w:type="dxa" w:w="140"/>
+              <w:bottom w:type="dxa" w:w="100"/>
+              <w:right w:type="dxa" w:w="140"/>
+            </w:tcMar>
+            <w:vAlign w:val="top"/>
+          </w:tcPr>
+          <w:p>
+            <w:pPr>
+              <w:keepNext/>
+              <w:spacing w:after="80" w:before="0" w:line="312"/>
+            </w:pPr>
+            <w:r>
+              <w:rPr>
+                <w:rFonts w:ascii="Times New Roman" w:cs="Times New Roman" w:eastAsia="Times New Roman" w:hAnsi="Times New Roman"/>
+                <w:b/>
+                <w:bCs/>
+                <w:sz w:val="24"/>
+                <w:szCs w:val="24"/>
+              </w:rPr>
+              <w:t xml:space="preserve">Thank You</w:t>
+            </w:r>
+            <w:r>
+              <w:rPr>
+                <w:rFonts w:ascii="Times New Roman" w:cs="Times New Roman" w:eastAsia="Times New Roman" w:hAnsi="Times New Roman"/>
+                <w:i/>
+                <w:iCs/>
+                <w:color w:val="404040"/>
+                <w:sz w:val="20"/>
+                <w:szCs w:val="20"/>
+              </w:rPr>
+              <w:t xml:space="preserve">  (Спасибо за внимание!)</w:t>
+            </w:r>
+          </w:p>
+          <w:p>
+            <w:pPr>
+              <w:spacing w:after="80" w:before="0" w:line="360"/>
+            </w:pPr>
+            <w:r>
+              <w:rPr>
+                <w:rFonts w:ascii="Times New Roman" w:cs="Times New Roman" w:eastAsia="Times New Roman" w:hAnsi="Times New Roman"/>
+                <w:sz w:val="28"/>
+                <w:szCs w:val="28"/>
+              </w:rPr>
+              <w:t xml:space="preserve">Thank you for your attention. We are ready to answer your questions.</w:t>
             </w:r>
           </w:p>
           <w:p>
@@ -5310,7 +6029,7 @@
                 <w:sz w:val="22"/>
                 <w:szCs w:val="22"/>
               </w:rPr>
-              <w:t xml:space="preserve">[ˈɡaɪɡə ˈkaʊntə] — “GUY-ger” (not “GAY-ger”)</w:t>
+              <w:t xml:space="preserve">“GUY-ger counter” (not “GAY-ger”) — счётчик Гейгера</w:t>
             </w:r>
           </w:p>
         </w:tc>
@@ -5376,7 +6095,7 @@
                 <w:sz w:val="22"/>
                 <w:szCs w:val="22"/>
               </w:rPr>
-              <w:t xml:space="preserve">millisievert [ˈmɪlɪˌsiːvərt]; 5 mSv — “five millisieverts”</w:t>
+              <w:t xml:space="preserve">millisievert — “MIL-ee-see-vert”; 5 mSv = “five millisieverts”</w:t>
             </w:r>
           </w:p>
         </w:tc>
@@ -5411,7 +6130,7 @@
                 <w:sz w:val="22"/>
                 <w:szCs w:val="22"/>
               </w:rPr>
-              <w:t xml:space="preserve">µSv, µSv/h</w:t>
+              <w:t xml:space="preserve">µR/h</w:t>
             </w:r>
           </w:p>
         </w:tc>
@@ -5442,7 +6161,7 @@
                 <w:sz w:val="22"/>
                 <w:szCs w:val="22"/>
               </w:rPr>
-              <w:t xml:space="preserve">microsievert [ˈmaɪkrəʊˌsiːvərt]; “four microsieverts per hour”</w:t>
+              <w:t xml:space="preserve">microroentgen per hour — “MY-kro-RENT-gen per hour”</w:t>
             </w:r>
           </w:p>
         </w:tc>
@@ -5477,7 +6196,7 @@
                 <w:sz w:val="22"/>
                 <w:szCs w:val="22"/>
               </w:rPr>
-              <w:t xml:space="preserve">µR/h (мкР/ч)</w:t>
+              <w:t xml:space="preserve">flight level 350</w:t>
             </w:r>
           </w:p>
         </w:tc>
@@ -5508,7 +6227,7 @@
                 <w:sz w:val="22"/>
                 <w:szCs w:val="22"/>
               </w:rPr>
-              <w:t xml:space="preserve">microroentgen per hour [ˌmaɪkrəʊˈrʌntɡən]; 13.2 — “thirteen point two”</w:t>
+              <w:t xml:space="preserve">“flight level three-five-zero” — эшелон FL350</w:t>
             </w:r>
           </w:p>
         </w:tc>
@@ -5543,7 +6262,7 @@
                 <w:sz w:val="22"/>
                 <w:szCs w:val="22"/>
               </w:rPr>
-              <w:t xml:space="preserve">ICRP (МКРЗ)</w:t>
+              <w:t xml:space="preserve">NILRA</w:t>
             </w:r>
           </w:p>
         </w:tc>
@@ -5574,7 +6293,7 @@
                 <w:sz w:val="22"/>
                 <w:szCs w:val="22"/>
               </w:rPr>
-              <w:t xml:space="preserve">“I-C-R-P” — International Commission on Radiological Protection</w:t>
+              <w:t xml:space="preserve">waypoint name — “NIL-ra”</w:t>
             </w:r>
           </w:p>
         </w:tc>
@@ -5609,7 +6328,7 @@
                 <w:sz w:val="22"/>
                 <w:szCs w:val="22"/>
               </w:rPr>
-              <w:t xml:space="preserve">NRB-99/2009</w:t>
+              <w:t xml:space="preserve">sanitary rules</w:t>
             </w:r>
           </w:p>
         </w:tc>
@@ -5640,7 +6359,7 @@
                 <w:sz w:val="22"/>
                 <w:szCs w:val="22"/>
               </w:rPr>
-              <w:t xml:space="preserve">“N-R-B ninety-nine, two thousand nine” — Radiation Safety Standards</w:t>
+              <w:t xml:space="preserve">санитарные правила (СанПиН)</w:t>
             </w:r>
           </w:p>
         </w:tc>
@@ -5675,7 +6394,7 @@
                 <w:sz w:val="22"/>
                 <w:szCs w:val="22"/>
               </w:rPr>
-              <w:t xml:space="preserve">SanPiN</w:t>
+              <w:t xml:space="preserve">radiation safety standards</w:t>
             </w:r>
           </w:p>
         </w:tc>
@@ -5706,7 +6425,7 @@
                 <w:sz w:val="22"/>
                 <w:szCs w:val="22"/>
               </w:rPr>
-              <w:t xml:space="preserve">“san-PEEN” — sanitary rules and norms</w:t>
+              <w:t xml:space="preserve">НРБ-99/2009 — read “N-R-B”</w:t>
             </w:r>
           </w:p>
         </w:tc>
@@ -5741,7 +6460,7 @@
                 <w:sz w:val="22"/>
                 <w:szCs w:val="22"/>
               </w:rPr>
-              <w:t xml:space="preserve">No. 3-FZ / No. 52-FZ</w:t>
+              <w:t xml:space="preserve">check of working conditions</w:t>
             </w:r>
           </w:p>
         </w:tc>
@@ -5772,7 +6491,7 @@
                 <w:sz w:val="22"/>
                 <w:szCs w:val="22"/>
               </w:rPr>
-              <w:t xml:space="preserve">“Federal Law number three F-Z / fifty-two F-Z”</w:t>
+              <w:t xml:space="preserve">СОУТ — специальная оценка условий труда</w:t>
             </w:r>
           </w:p>
         </w:tc>
@@ -5807,7 +6526,7 @@
                 <w:sz w:val="22"/>
                 <w:szCs w:val="22"/>
               </w:rPr>
-              <w:t xml:space="preserve">Order No. 255n</w:t>
+              <w:t xml:space="preserve">test flight</w:t>
             </w:r>
           </w:p>
         </w:tc>
@@ -5838,7 +6557,7 @@
                 <w:sz w:val="22"/>
                 <w:szCs w:val="22"/>
               </w:rPr>
-              <w:t xml:space="preserve">“Order number two-five-five N” of the Ministry of Labour</w:t>
+              <w:t xml:space="preserve">контрольный полёт</w:t>
             </w:r>
           </w:p>
         </w:tc>
@@ -5873,7 +6592,7 @@
                 <w:sz w:val="22"/>
                 <w:szCs w:val="22"/>
               </w:rPr>
-              <w:t xml:space="preserve">Directive 2013/59/Euratom</w:t>
+              <w:t xml:space="preserve">state dose register</w:t>
             </w:r>
           </w:p>
         </w:tc>
@@ -5904,7 +6623,7 @@
                 <w:sz w:val="22"/>
                 <w:szCs w:val="22"/>
               </w:rPr>
-              <w:t xml:space="preserve">“Directive twenty-thirteen slash fifty-nine Euratom” [ˈjʊərətɒm]</w:t>
+              <w:t xml:space="preserve">ЕСКИД — единая система учёта доз</w:t>
             </w:r>
           </w:p>
         </w:tc>
@@ -5939,7 +6658,7 @@
                 <w:sz w:val="22"/>
                 <w:szCs w:val="22"/>
               </w:rPr>
-              <w:t xml:space="preserve">CARI-7</w:t>
+              <w:t xml:space="preserve">control level</w:t>
             </w:r>
           </w:p>
         </w:tc>
@@ -5970,7 +6689,7 @@
                 <w:sz w:val="22"/>
                 <w:szCs w:val="22"/>
               </w:rPr>
-              <w:t xml:space="preserve">“carry seven” — dose calculation program of the US FAA</w:t>
+              <w:t xml:space="preserve">контрольный уровень (ниже предела)</w:t>
             </w:r>
           </w:p>
         </w:tc>
@@ -6005,7 +6724,7 @@
                 <w:sz w:val="22"/>
                 <w:szCs w:val="22"/>
               </w:rPr>
-              <w:t xml:space="preserve">RUSCOSMICS</w:t>
+              <w:t xml:space="preserve">work schedule</w:t>
             </w:r>
           </w:p>
         </w:tc>
@@ -6036,7 +6755,7 @@
                 <w:sz w:val="22"/>
                 <w:szCs w:val="22"/>
               </w:rPr>
-              <w:t xml:space="preserve">“rus-COZ-mics” — Russian cosmic-ray model (Polar Geophysical Institute)</w:t>
+              <w:t xml:space="preserve">график работы (полётов)</w:t>
             </w:r>
           </w:p>
         </w:tc>
@@ -6071,7 +6790,7 @@
                 <w:sz w:val="22"/>
                 <w:szCs w:val="22"/>
               </w:rPr>
-              <w:t xml:space="preserve">FL350</w:t>
+              <w:t xml:space="preserve">European Union</w:t>
             </w:r>
           </w:p>
         </w:tc>
@@ -6102,7 +6821,7 @@
                 <w:sz w:val="22"/>
                 <w:szCs w:val="22"/>
               </w:rPr>
-              <w:t xml:space="preserve">“flight level three-five-zero” (about 35,000 ft)</w:t>
+              <w:t xml:space="preserve">ЕС; “Euratom” — “YOOR-a-tom”</w:t>
             </w:r>
           </w:p>
         </w:tc>
@@ -6137,7 +6856,7 @@
                 <w:sz w:val="22"/>
                 <w:szCs w:val="22"/>
               </w:rPr>
-              <w:t xml:space="preserve">CFP</w:t>
+              <w:t xml:space="preserve">supervisor</w:t>
             </w:r>
           </w:p>
         </w:tc>
@@ -6168,337 +6887,7 @@
                 <w:sz w:val="22"/>
                 <w:szCs w:val="22"/>
               </w:rPr>
-              <w:t xml:space="preserve">computer flight plan</w:t>
-            </w:r>
-          </w:p>
-        </w:tc>
-      </w:tr>
-      <w:tr>
-        <w:tc>
-          <w:tcPr>
-            <w:tcW w:type="dxa" w:w="3000"/>
-            <w:tcBorders>
-              <w:top w:val="single" w:color="000000" w:sz="4"/>
-              <w:left w:val="single" w:color="000000" w:sz="4"/>
-              <w:bottom w:val="single" w:color="000000" w:sz="4"/>
-              <w:right w:val="single" w:color="000000" w:sz="4"/>
-            </w:tcBorders>
-            <w:tcMar>
-              <w:top w:type="dxa" w:w="100"/>
-              <w:left w:type="dxa" w:w="140"/>
-              <w:bottom w:type="dxa" w:w="100"/>
-              <w:right w:type="dxa" w:w="140"/>
-            </w:tcMar>
-            <w:vAlign w:val="top"/>
-          </w:tcPr>
-          <w:p>
-            <w:pPr>
-              <w:spacing w:after="0" w:before="0" w:line="312"/>
-            </w:pPr>
-            <w:r>
-              <w:rPr>
-                <w:rFonts w:ascii="Times New Roman" w:cs="Times New Roman" w:eastAsia="Times New Roman" w:hAnsi="Times New Roman"/>
-                <w:b/>
-                <w:bCs/>
-                <w:sz w:val="22"/>
-                <w:szCs w:val="22"/>
-              </w:rPr>
-              <w:t xml:space="preserve">special assessment of working conditions</w:t>
-            </w:r>
-          </w:p>
-        </w:tc>
-        <w:tc>
-          <w:tcPr>
-            <w:tcW w:type="dxa" w:w="6638"/>
-            <w:tcBorders>
-              <w:top w:val="single" w:color="000000" w:sz="4"/>
-              <w:left w:val="single" w:color="000000" w:sz="4"/>
-              <w:bottom w:val="single" w:color="000000" w:sz="4"/>
-              <w:right w:val="single" w:color="000000" w:sz="4"/>
-            </w:tcBorders>
-            <w:tcMar>
-              <w:top w:type="dxa" w:w="100"/>
-              <w:left w:type="dxa" w:w="140"/>
-              <w:bottom w:type="dxa" w:w="100"/>
-              <w:right w:type="dxa" w:w="140"/>
-            </w:tcMar>
-            <w:vAlign w:val="top"/>
-          </w:tcPr>
-          <w:p>
-            <w:pPr>
-              <w:spacing w:after="0" w:before="0" w:line="312"/>
-            </w:pPr>
-            <w:r>
-              <w:rPr>
-                <w:rFonts w:ascii="Times New Roman" w:cs="Times New Roman" w:eastAsia="Times New Roman" w:hAnsi="Times New Roman"/>
-                <w:sz w:val="22"/>
-                <w:szCs w:val="22"/>
-              </w:rPr>
-              <w:t xml:space="preserve">СОУТ — специальная оценка условий труда</w:t>
-            </w:r>
-          </w:p>
-        </w:tc>
-      </w:tr>
-      <w:tr>
-        <w:tc>
-          <w:tcPr>
-            <w:tcW w:type="dxa" w:w="3000"/>
-            <w:tcBorders>
-              <w:top w:val="single" w:color="000000" w:sz="4"/>
-              <w:left w:val="single" w:color="000000" w:sz="4"/>
-              <w:bottom w:val="single" w:color="000000" w:sz="4"/>
-              <w:right w:val="single" w:color="000000" w:sz="4"/>
-            </w:tcBorders>
-            <w:tcMar>
-              <w:top w:type="dxa" w:w="100"/>
-              <w:left w:type="dxa" w:w="140"/>
-              <w:bottom w:type="dxa" w:w="100"/>
-              <w:right w:type="dxa" w:w="140"/>
-            </w:tcMar>
-            <w:vAlign w:val="top"/>
-          </w:tcPr>
-          <w:p>
-            <w:pPr>
-              <w:spacing w:after="0" w:before="0" w:line="312"/>
-            </w:pPr>
-            <w:r>
-              <w:rPr>
-                <w:rFonts w:ascii="Times New Roman" w:cs="Times New Roman" w:eastAsia="Times New Roman" w:hAnsi="Times New Roman"/>
-                <w:b/>
-                <w:bCs/>
-                <w:sz w:val="22"/>
-                <w:szCs w:val="22"/>
-              </w:rPr>
-              <w:t xml:space="preserve">Article 35(3)</w:t>
-            </w:r>
-          </w:p>
-        </w:tc>
-        <w:tc>
-          <w:tcPr>
-            <w:tcW w:type="dxa" w:w="6638"/>
-            <w:tcBorders>
-              <w:top w:val="single" w:color="000000" w:sz="4"/>
-              <w:left w:val="single" w:color="000000" w:sz="4"/>
-              <w:bottom w:val="single" w:color="000000" w:sz="4"/>
-              <w:right w:val="single" w:color="000000" w:sz="4"/>
-            </w:tcBorders>
-            <w:tcMar>
-              <w:top w:type="dxa" w:w="100"/>
-              <w:left w:type="dxa" w:w="140"/>
-              <w:bottom w:type="dxa" w:w="100"/>
-              <w:right w:type="dxa" w:w="140"/>
-            </w:tcMar>
-            <w:vAlign w:val="top"/>
-          </w:tcPr>
-          <w:p>
-            <w:pPr>
-              <w:spacing w:after="0" w:before="0" w:line="312"/>
-            </w:pPr>
-            <w:r>
-              <w:rPr>
-                <w:rFonts w:ascii="Times New Roman" w:cs="Times New Roman" w:eastAsia="Times New Roman" w:hAnsi="Times New Roman"/>
-                <w:sz w:val="22"/>
-                <w:szCs w:val="22"/>
-              </w:rPr>
-              <w:t xml:space="preserve">“Article thirty-five, paragraph three”</w:t>
-            </w:r>
-          </w:p>
-        </w:tc>
-      </w:tr>
-      <w:tr>
-        <w:tc>
-          <w:tcPr>
-            <w:tcW w:type="dxa" w:w="3000"/>
-            <w:tcBorders>
-              <w:top w:val="single" w:color="000000" w:sz="4"/>
-              <w:left w:val="single" w:color="000000" w:sz="4"/>
-              <w:bottom w:val="single" w:color="000000" w:sz="4"/>
-              <w:right w:val="single" w:color="000000" w:sz="4"/>
-            </w:tcBorders>
-            <w:tcMar>
-              <w:top w:type="dxa" w:w="100"/>
-              <w:left w:type="dxa" w:w="140"/>
-              <w:bottom w:type="dxa" w:w="100"/>
-              <w:right w:type="dxa" w:w="140"/>
-            </w:tcMar>
-            <w:vAlign w:val="top"/>
-          </w:tcPr>
-          <w:p>
-            <w:pPr>
-              <w:spacing w:after="0" w:before="0" w:line="312"/>
-            </w:pPr>
-            <w:r>
-              <w:rPr>
-                <w:rFonts w:ascii="Times New Roman" w:cs="Times New Roman" w:eastAsia="Times New Roman" w:hAnsi="Times New Roman"/>
-                <w:b/>
-                <w:bCs/>
-                <w:sz w:val="22"/>
-                <w:szCs w:val="22"/>
-              </w:rPr>
-              <w:t xml:space="preserve">NILRA</w:t>
-            </w:r>
-          </w:p>
-        </w:tc>
-        <w:tc>
-          <w:tcPr>
-            <w:tcW w:type="dxa" w:w="6638"/>
-            <w:tcBorders>
-              <w:top w:val="single" w:color="000000" w:sz="4"/>
-              <w:left w:val="single" w:color="000000" w:sz="4"/>
-              <w:bottom w:val="single" w:color="000000" w:sz="4"/>
-              <w:right w:val="single" w:color="000000" w:sz="4"/>
-            </w:tcBorders>
-            <w:tcMar>
-              <w:top w:type="dxa" w:w="100"/>
-              <w:left w:type="dxa" w:w="140"/>
-              <w:bottom w:type="dxa" w:w="100"/>
-              <w:right w:type="dxa" w:w="140"/>
-            </w:tcMar>
-            <w:vAlign w:val="top"/>
-          </w:tcPr>
-          <w:p>
-            <w:pPr>
-              <w:spacing w:after="0" w:before="0" w:line="312"/>
-            </w:pPr>
-            <w:r>
-              <w:rPr>
-                <w:rFonts w:ascii="Times New Roman" w:cs="Times New Roman" w:eastAsia="Times New Roman" w:hAnsi="Times New Roman"/>
-                <w:sz w:val="22"/>
-                <w:szCs w:val="22"/>
-              </w:rPr>
-              <w:t xml:space="preserve">route waypoint: “NIL-ra”</w:t>
-            </w:r>
-          </w:p>
-        </w:tc>
-      </w:tr>
-      <w:tr>
-        <w:tc>
-          <w:tcPr>
-            <w:tcW w:type="dxa" w:w="3000"/>
-            <w:tcBorders>
-              <w:top w:val="single" w:color="000000" w:sz="4"/>
-              <w:left w:val="single" w:color="000000" w:sz="4"/>
-              <w:bottom w:val="single" w:color="000000" w:sz="4"/>
-              <w:right w:val="single" w:color="000000" w:sz="4"/>
-            </w:tcBorders>
-            <w:tcMar>
-              <w:top w:type="dxa" w:w="100"/>
-              <w:left w:type="dxa" w:w="140"/>
-              <w:bottom w:type="dxa" w:w="100"/>
-              <w:right w:type="dxa" w:w="140"/>
-            </w:tcMar>
-            <w:vAlign w:val="top"/>
-          </w:tcPr>
-          <w:p>
-            <w:pPr>
-              <w:spacing w:after="0" w:before="0" w:line="312"/>
-            </w:pPr>
-            <w:r>
-              <w:rPr>
-                <w:rFonts w:ascii="Times New Roman" w:cs="Times New Roman" w:eastAsia="Times New Roman" w:hAnsi="Times New Roman"/>
-                <w:b/>
-                <w:bCs/>
-                <w:sz w:val="22"/>
-                <w:szCs w:val="22"/>
-              </w:rPr>
-              <w:t xml:space="preserve">Order No. 381</w:t>
-            </w:r>
-          </w:p>
-        </w:tc>
-        <w:tc>
-          <w:tcPr>
-            <w:tcW w:type="dxa" w:w="6638"/>
-            <w:tcBorders>
-              <w:top w:val="single" w:color="000000" w:sz="4"/>
-              <w:left w:val="single" w:color="000000" w:sz="4"/>
-              <w:bottom w:val="single" w:color="000000" w:sz="4"/>
-              <w:right w:val="single" w:color="000000" w:sz="4"/>
-            </w:tcBorders>
-            <w:tcMar>
-              <w:top w:type="dxa" w:w="100"/>
-              <w:left w:type="dxa" w:w="140"/>
-              <w:bottom w:type="dxa" w:w="100"/>
-              <w:right w:type="dxa" w:w="140"/>
-            </w:tcMar>
-            <w:vAlign w:val="top"/>
-          </w:tcPr>
-          <w:p>
-            <w:pPr>
-              <w:spacing w:after="0" w:before="0" w:line="312"/>
-            </w:pPr>
-            <w:r>
-              <w:rPr>
-                <w:rFonts w:ascii="Times New Roman" w:cs="Times New Roman" w:eastAsia="Times New Roman" w:hAnsi="Times New Roman"/>
-                <w:sz w:val="22"/>
-                <w:szCs w:val="22"/>
-              </w:rPr>
-              <w:t xml:space="preserve">“Order number three-eight-one” of the Ministry of Transport</w:t>
-            </w:r>
-          </w:p>
-        </w:tc>
-      </w:tr>
-      <w:tr>
-        <w:tc>
-          <w:tcPr>
-            <w:tcW w:type="dxa" w:w="3000"/>
-            <w:tcBorders>
-              <w:top w:val="single" w:color="000000" w:sz="4"/>
-              <w:left w:val="single" w:color="000000" w:sz="4"/>
-              <w:bottom w:val="single" w:color="000000" w:sz="4"/>
-              <w:right w:val="single" w:color="000000" w:sz="4"/>
-            </w:tcBorders>
-            <w:tcMar>
-              <w:top w:type="dxa" w:w="100"/>
-              <w:left w:type="dxa" w:w="140"/>
-              <w:bottom w:type="dxa" w:w="100"/>
-              <w:right w:type="dxa" w:w="140"/>
-            </w:tcMar>
-            <w:vAlign w:val="top"/>
-          </w:tcPr>
-          <w:p>
-            <w:pPr>
-              <w:spacing w:after="0" w:before="0" w:line="312"/>
-            </w:pPr>
-            <w:r>
-              <w:rPr>
-                <w:rFonts w:ascii="Times New Roman" w:cs="Times New Roman" w:eastAsia="Times New Roman" w:hAnsi="Times New Roman"/>
-                <w:b/>
-                <w:bCs/>
-                <w:sz w:val="22"/>
-                <w:szCs w:val="22"/>
-              </w:rPr>
-              <w:t xml:space="preserve">SanPiN codes</w:t>
-            </w:r>
-          </w:p>
-        </w:tc>
-        <w:tc>
-          <w:tcPr>
-            <w:tcW w:type="dxa" w:w="6638"/>
-            <w:tcBorders>
-              <w:top w:val="single" w:color="000000" w:sz="4"/>
-              <w:left w:val="single" w:color="000000" w:sz="4"/>
-              <w:bottom w:val="single" w:color="000000" w:sz="4"/>
-              <w:right w:val="single" w:color="000000" w:sz="4"/>
-            </w:tcBorders>
-            <w:tcMar>
-              <w:top w:type="dxa" w:w="100"/>
-              <w:left w:type="dxa" w:w="140"/>
-              <w:bottom w:type="dxa" w:w="100"/>
-              <w:right w:type="dxa" w:w="140"/>
-            </w:tcMar>
-            <w:vAlign w:val="top"/>
-          </w:tcPr>
-          <w:p>
-            <w:pPr>
-              <w:spacing w:after="0" w:before="0" w:line="312"/>
-            </w:pPr>
-            <w:r>
-              <w:rPr>
-                <w:rFonts w:ascii="Times New Roman" w:cs="Times New Roman" w:eastAsia="Times New Roman" w:hAnsi="Times New Roman"/>
-                <w:sz w:val="22"/>
-                <w:szCs w:val="22"/>
-              </w:rPr>
-              <w:t xml:space="preserve">on slide 7 just say “the SanPiNs of 2008 and 2010” — no need to read the full numbers</w:t>
+              <w:t xml:space="preserve">научный руководитель</w:t>
             </w:r>
           </w:p>
         </w:tc>
@@ -6630,7 +7019,7 @@
                 <w:sz w:val="24"/>
                 <w:szCs w:val="24"/>
               </w:rPr>
-              <w:t xml:space="preserve">A Geiger counter underestimates the dose. Why do you use these measurements at all?</w:t>
+              <w:t xml:space="preserve">Why do you use data from a Geiger counter if it does not measure neutrons?</w:t>
             </w:r>
           </w:p>
           <w:p>
@@ -6653,7 +7042,7 @@
                 <w:sz w:val="24"/>
                 <w:szCs w:val="24"/>
               </w:rPr>
-              <w:t xml:space="preserve">They come from my previous work and show the main thing clearly: at cruising level the background is about sixteen times higher than near the ground. But a Geiger counter practically does not register neutrons, which create a large part of the dose at altitude. That is why for a legal assessment the annual dose is calculated from real flights — with programs such as CARI-7 or with data from the RUSCOSMICS model.</w:t>
+              <w:t xml:space="preserve">The measurements only show the problem: at cruising level radiation is much higher. For the law, the dose must be calculated with a special program. This is one of our proposals.</w:t>
             </w:r>
           </w:p>
         </w:tc>
@@ -6784,7 +7173,7 @@
                 <w:sz w:val="24"/>
                 <w:szCs w:val="24"/>
               </w:rPr>
-              <w:t xml:space="preserve">Why is the limit for aircrew 5 millisieverts and not 20, as for personnel working with radiation sources?</w:t>
+              <w:t xml:space="preserve">So is there no regulation in Russia at all?</w:t>
             </w:r>
           </w:p>
           <w:p>
@@ -6807,7 +7196,7 @@
                 <w:sz w:val="24"/>
                 <w:szCs w:val="24"/>
               </w:rPr>
-              <w:t xml:space="preserve">NRB-99/2009 distinguishes between man-made and natural sources. For personnel working with man-made sources (group A), the limit is 20 millisieverts per year on average over any five consecutive years, but not more than 50 in a single year. Cosmic radiation is natural, and clause 4.3 says that it is regulated as natural exposure under occupational conditions under clause 4.1 — that is, 5 millisieverts per year.</w:t>
+              <w:t xml:space="preserve">There is a limit: 5 millisieverts a year. The problem is that the law does not say who calculates the dose and how. So nobody can check the limit for each person.</w:t>
             </w:r>
           </w:p>
         </w:tc>
@@ -6938,7 +7327,7 @@
                 <w:sz w:val="24"/>
                 <w:szCs w:val="24"/>
               </w:rPr>
-              <w:t xml:space="preserve">Who is responsible for a crew member’s dose today?</w:t>
+              <w:t xml:space="preserve">Why do you suggest 1 millisievert as a threshold?</w:t>
             </w:r>
           </w:p>
           <w:p>
@@ -6961,7 +7350,7 @@
                 <w:sz w:val="24"/>
                 <w:szCs w:val="24"/>
               </w:rPr>
-              <w:t xml:space="preserve">Under Article 214 of the Labour Code, the airline as the employer must ensure safe working conditions, and Article 18 of Federal Law No. 3-FZ provides for monitoring and recording of individual doses in general, through a single state system. But there is no special procedure for calculating each crew member’s dose from all their flights — this is the gap we point out.</w:t>
+              <w:t xml:space="preserve">The same threshold is used in the European Union and in Germany. Old Russian sanitary rules also used it. Above this level, the dose should be calculated for each person.</w:t>
             </w:r>
           </w:p>
         </w:tc>
@@ -7090,7 +7479,7 @@
                 <w:sz w:val="24"/>
                 <w:szCs w:val="24"/>
               </w:rPr>
-              <w:t xml:space="preserve">Is 900 flight hours a year dangerous for pilots?</w:t>
+              <w:t xml:space="preserve">Will this be expensive for airlines?</w:t>
             </w:r>
           </w:p>
           <w:p>
@@ -7113,7 +7502,7 @@
                 <w:sz w:val="24"/>
                 <w:szCs w:val="24"/>
               </w:rPr>
-              <w:t xml:space="preserve">By our estimate it gives about 3.6 millisieverts — below the limit, but more than 70 percent of it. On high-latitude routes and during solar flares the dose rate is higher, so without individual records a crew member could come close to the limit.</w:t>
+              <w:t xml:space="preserve">Not very. A computer program can calculate the dose from flight data that airlines already have. In France, airlines use one common state system for this.</w:t>
             </w:r>
           </w:p>
         </w:tc>
@@ -7244,7 +7633,7 @@
                 <w:sz w:val="24"/>
                 <w:szCs w:val="24"/>
               </w:rPr>
-              <w:t xml:space="preserve">What exactly do you propose?</w:t>
+              <w:t xml:space="preserve">Who should make these changes?</w:t>
             </w:r>
           </w:p>
           <w:p>
@@ -7267,7 +7656,7 @@
                 <w:sz w:val="24"/>
                 <w:szCs w:val="24"/>
               </w:rPr>
-              <w:t xml:space="preserve">To establish a uniform procedure: calculate the individual dose of each crew member from actual flights, inform employees about their doses and take the doses into account when drawing up schedules — similar to Article 35, paragraph 3 of Directive 2013/59/Euratom.</w:t>
+              <w:t xml:space="preserve">The sanitary rules — the Chief State Sanitary Doctor. Flight time rules — the Ministry of Transport. The check of working conditions — the Ministry of Labour. Most changes do not need new federal laws.</w:t>
             </w:r>
           </w:p>
         </w:tc>

</xml_diff>

<commit_message>
Treat the work as new: remove references to previous work; Arial GOST deck
- Removed all mentions of the previous work and its reference; renumbered citations
- GOST deck uses Arial 24/32 pt per common presentation guidelines
- Table and caption fixes from the re-check

Co-Authored-By: Claude Opus 5.5 <noreply@anthropic.com>
Claude-Session: https://claude.ai/code/session_01CdksXxatJkGzkSNxfzYT6S
</commit_message>
<xml_diff>
--- a/Speech_EN_Nikita_Ilya.docx
+++ b/Speech_EN_Nikita_Ilya.docx
@@ -935,7 +935,7 @@
                 <w:sz w:val="22"/>
                 <w:szCs w:val="22"/>
               </w:rPr>
-              <w:t xml:space="preserve">0:45</w:t>
+              <w:t xml:space="preserve">0:50</w:t>
             </w:r>
           </w:p>
         </w:tc>
@@ -3286,7 +3286,7 @@
                 <w:sz w:val="20"/>
                 <w:szCs w:val="20"/>
               </w:rPr>
-              <w:t xml:space="preserve">0:45</w:t>
+              <w:t xml:space="preserve">0:50</w:t>
             </w:r>
           </w:p>
         </w:tc>
@@ -3344,7 +3344,7 @@
                 <w:sz w:val="28"/>
                 <w:szCs w:val="28"/>
               </w:rPr>
-              <w:t xml:space="preserve">Why is this topic important? At cruising level, radiation is 11 to 22 times higher than on the ground. Since 1990, international experts have treated this exposure as part of the job. Special sanitary rules for aircrew were cancelled in 2021 and 2025. And with 900 flight hours a year, the dose can reach about 3.6 millisieverts. That is more than 70 percent of the limit. So our question is simple: does the law really protect each crew member?</w:t>
+              <w:t xml:space="preserve">Why is this topic important? At cruising level, radiation is 11 to 22 times higher than on the ground. Since 1990, international experts have treated this exposure as part of the job. We checked this with our own measurements on board. Special sanitary rules for aircrew were cancelled in 2021 and 2025. And with 900 flight hours a year, the dose can reach about 3.6 millisieverts. That is more than 70 percent of the limit. So our question is simple: does the law really protect each crew member?</w:t>
             </w:r>
           </w:p>
           <w:p>
@@ -3696,7 +3696,7 @@
                 <w:sz w:val="28"/>
                 <w:szCs w:val="28"/>
               </w:rPr>
-              <w:t xml:space="preserve">First, a few facts from my previous work. I measured radiation on two flights with a home-made Geiger counter. Near the ground the device showed about 8 to 15 microroentgens per hour. At cruising level it showed 170 to 184. But a Geiger counter does not see neutrons, and neutrons give a large part of the dose. So the real annual dose must be calculated, not just measured.</w:t>
+              <w:t xml:space="preserve">First, our measurements. We measured radiation on two flights with a home-made Geiger counter. Near the ground the device showed about 8 to 15 microroentgens per hour. At cruising level it showed 170 to 184. But a Geiger counter does not see neutrons, and neutrons give a large part of the dose. So the real annual dose must be calculated, not just measured.</w:t>
             </w:r>
           </w:p>
           <w:p>
@@ -7042,7 +7042,7 @@
                 <w:sz w:val="24"/>
                 <w:szCs w:val="24"/>
               </w:rPr>
-              <w:t xml:space="preserve">The measurements only show the problem: at cruising level radiation is much higher. For the law, the dose must be calculated with a special program. This is one of our proposals.</w:t>
+              <w:t xml:space="preserve">Our measurements only show the problem: at cruising level radiation is much higher. For the law, the dose must be calculated with a special program. This is one of our proposals.</w:t>
             </w:r>
           </w:p>
         </w:tc>

</xml_diff>